<commit_message>
Remove autenticação por senha; identificação só por apelido
O apelido único já basta para identificar o cliente (requisito
obrigatório do trabalho); a camada de conta/senha (auto-registro,
REGISTRAR/"Criar conta", hash PBKDF2) estava causando confusão sem
agregar valor real ao escopo do trabalho. A persistência em banco de
dados passa a servir só ao histórico de mensagens.
</commit_message>
<xml_diff>
--- a/Relatorio_Tecnico.docx
+++ b/Relatorio_Tecnico.docx
@@ -124,7 +124,7 @@
         <w:spacing w:after="160" w:line="300"/>
       </w:pPr>
       <w:r>
-        <w:t>Este relatório descreve a implementação de um sistema de chat cliente-servidor desenvolvido para a disciplina de Redes de Computadores II. O sistema permite que múltiplos clientes se conectem simultaneamente a um servidor central, troquem mensagens em modo de conversa geral (broadcast) e em conversas privadas, sejam notificados sobre a entrada e saída de outros usuários e consultem a lista de usuários conectados no momento. Além dos requisitos obrigatórios, foram implementados quatro itens opcionais do enunciado: interface gráfica (Tkinter), autenticação com senha, persistência do histórico de mensagens em banco de dados SQLite, e criação de salas/canais temáticos.</w:t>
+        <w:t>Este relatório descreve a implementação de um sistema de chat cliente-servidor desenvolvido para a disciplina de Redes de Computadores II. O sistema permite que múltiplos clientes se conectem simultaneamente a um servidor central, troquem mensagens em modo de conversa geral (broadcast) e em conversas privadas, sejam notificados sobre a entrada e saída de outros usuários e consultem a lista de usuários conectados no momento. Além dos requisitos obrigatórios, foram implementados três itens opcionais do enunciado: interface gráfica (Tkinter, tanto para o cliente quanto para o servidor), persistência do histórico de mensagens em banco de dados SQLite, e criação de salas/canais temáticos.</w:t>
       </w:r>
     </w:p>
     <w:p>
@@ -2947,7 +2947,7 @@
         <w:spacing w:after="160" w:line="300"/>
       </w:pPr>
       <w:r>
-        <w:t>O trabalho permitiu aplicar na prática os conceitos de programação com sockets, protocolos de aplicação e transporte confiável estudados na disciplina. A implementação atende a todos os requisitos funcionais obrigatórios do enunciado — múltiplos clientes simultâneos, identificação por apelido único, broadcast, mensagens privadas, notificações de entrada/saída, listagem de usuários e encerramento controlado — além de um protocolo de aplicação próprio, documentado e configurável quanto ao endereço de rede utilizado, e de quatro itens opcionais: interface gráfica, autenticação com senha, persistência de histórico e salas/canais temáticos.</w:t>
+        <w:t>O trabalho permitiu aplicar na prática os conceitos de programação com sockets, protocolos de aplicação e transporte confiável estudados na disciplina. A implementação atende a todos os requisitos funcionais obrigatórios do enunciado — múltiplos clientes simultâneos, identificação por apelido único, broadcast, mensagens privadas, notificações de entrada/saída, listagem de usuários e encerramento controlado — além de um protocolo de aplicação próprio, documentado e configurável quanto ao endereço de rede utilizado, e de três itens opcionais: interface gráfica, persistência de histórico e salas/canais temáticos.</w:t>
       </w:r>
     </w:p>
     <w:sectPr>

</xml_diff>

<commit_message>
Simplifica comentários e adiciona reconexão automática no cliente
Comentários e docstrings extensos foram reduzidos a notas mais
diretas em todos os módulos (código sem mudança funcional). O
cliente gráfico ganhou reconexão automática: se a conexão cair, ele
tenta reconectar com o mesmo apelido a cada 3s até o servidor voltar,
em vez de exigir logar de novo manualmente.

Também inclui a remoção do placeholder de "espaço para preencher"
no relatório técnico (seção de testes em laboratório).
</commit_message>
<xml_diff>
--- a/Relatorio_Tecnico.docx
+++ b/Relatorio_Tecnico.docx
@@ -4,14 +4,15 @@
   <w:body>
     <w:p>
       <w:pPr>
-        <w:spacing w:before="2000"/>
+        <w:spacing w:before="2000" w:line="240" w:lineRule="auto" w:after="0"/>
         <w:jc w:val="center"/>
       </w:pPr>
       <w:r>
         <w:rPr>
+          <w:rFonts w:ascii="Times New Roman" w:hAnsi="Times New Roman" w:eastAsia="Times New Roman"/>
           <w:b/>
           <w:bCs/>
-          <w:sz w:val="26"/>
+          <w:sz w:val="28"/>
           <w:szCs w:val="26"/>
         </w:rPr>
         <w:t xml:space="preserve">UNIVERSIDADE ESTADUAL DO SUDOESTE DA BAHIA</w:t>
@@ -19,11 +20,12 @@
     </w:p>
     <w:p>
       <w:pPr>
-        <w:spacing w:after="800"/>
+        <w:spacing w:after="0" w:line="240" w:lineRule="auto"/>
         <w:jc w:val="center"/>
       </w:pPr>
       <w:r>
         <w:rPr>
+          <w:rFonts w:ascii="Times New Roman" w:hAnsi="Times New Roman" w:eastAsia="Times New Roman"/>
           <w:sz w:val="24"/>
           <w:szCs w:val="24"/>
         </w:rPr>
@@ -32,15 +34,66 @@
     </w:p>
     <w:p>
       <w:pPr>
-        <w:spacing w:after="200" w:before="1600"/>
+        <w:spacing w:line="240" w:lineRule="auto"/>
         <w:jc w:val="center"/>
       </w:pPr>
-      <w:r>
-        <w:rPr>
+    </w:p>
+    <w:p>
+      <w:pPr>
+        <w:spacing w:line="240" w:lineRule="auto"/>
+        <w:jc w:val="center"/>
+      </w:pPr>
+    </w:p>
+    <w:p>
+      <w:pPr>
+        <w:spacing w:line="240" w:lineRule="auto"/>
+        <w:jc w:val="center"/>
+      </w:pPr>
+      <w:r>
+        <w:rPr>
+          <w:rFonts w:ascii="Times New Roman" w:hAnsi="Times New Roman" w:eastAsia="Times New Roman"/>
+          <w:sz w:val="24"/>
+        </w:rPr>
+        <w:t>Kalel Ezveither de Souza Oliveira Neves</w:t>
+      </w:r>
+    </w:p>
+    <w:p>
+      <w:pPr>
+        <w:spacing w:line="240" w:lineRule="auto"/>
+        <w:jc w:val="center"/>
+      </w:pPr>
+      <w:r>
+        <w:rPr>
+          <w:rFonts w:ascii="Times New Roman" w:hAnsi="Times New Roman" w:eastAsia="Times New Roman"/>
+          <w:sz w:val="24"/>
+        </w:rPr>
+        <w:t>Giovana Fortunato Costa Gomes</w:t>
+      </w:r>
+    </w:p>
+    <w:p>
+      <w:pPr>
+        <w:spacing w:line="240" w:lineRule="auto"/>
+        <w:jc w:val="center"/>
+      </w:pPr>
+    </w:p>
+    <w:p>
+      <w:pPr>
+        <w:spacing w:line="240" w:lineRule="auto"/>
+        <w:jc w:val="center"/>
+      </w:pPr>
+    </w:p>
+    <w:p>
+      <w:pPr>
+        <w:spacing w:after="0" w:before="1600" w:line="240" w:lineRule="auto"/>
+        <w:jc w:val="center"/>
+      </w:pPr>
+      <w:r>
+        <w:rPr>
+          <w:rFonts w:ascii="Times New Roman" w:hAnsi="Times New Roman" w:eastAsia="Times New Roman"/>
           <w:b/>
           <w:bCs/>
           <w:color w:val="1A4971"/>
-          <w:sz w:val="40"/>
+          <w:sz w:val="32"/>
           <w:szCs w:val="40"/>
         </w:rPr>
         <w:t xml:space="preserve">RELATÓRIO TÉCNICO</w:t>
@@ -48,11 +101,12 @@
     </w:p>
     <w:p>
       <w:pPr>
-        <w:spacing w:after="1600"/>
+        <w:spacing w:after="0" w:line="240" w:lineRule="auto"/>
         <w:jc w:val="center"/>
       </w:pPr>
       <w:r>
         <w:rPr>
+          <w:rFonts w:ascii="Times New Roman" w:hAnsi="Times New Roman" w:eastAsia="Times New Roman"/>
           <w:color w:val="2B6CB0"/>
           <w:sz w:val="28"/>
           <w:szCs w:val="28"/>
@@ -62,42 +116,39 @@
     </w:p>
     <w:p>
       <w:pPr>
-        <w:spacing w:before="3200"/>
         <w:jc w:val="center"/>
       </w:pPr>
-      <w:r>
-        <w:rPr>
-          <w:sz w:val="22"/>
-          <w:szCs w:val="22"/>
-        </w:rPr>
-        <w:t xml:space="preserve">Dupla: ______________________________</w:t>
-      </w:r>
-    </w:p>
-    <w:p>
-      <w:pPr>
-        <w:spacing w:before="200"/>
+    </w:p>
+    <w:p>
+      <w:pPr>
         <w:jc w:val="center"/>
       </w:pPr>
-      <w:r>
-        <w:rPr>
-          <w:sz w:val="22"/>
-          <w:szCs w:val="22"/>
-        </w:rPr>
-        <w:t xml:space="preserve">________________________________________</w:t>
-      </w:r>
-    </w:p>
-    <w:p>
-      <w:pPr>
-        <w:spacing w:before="1600"/>
+    </w:p>
+    <w:p>
+      <w:pPr>
+        <w:spacing w:before="1600" w:after="0" w:line="240" w:lineRule="auto"/>
         <w:jc w:val="center"/>
       </w:pPr>
-      <w:r>
-        <w:rPr>
-          <w:color w:val="4A5568"/>
-          <w:sz w:val="20"/>
-          <w:szCs w:val="20"/>
-        </w:rPr>
-        <w:t xml:space="preserve">Vitória da Conquista — BA, Agosto de 2026</w:t>
+      <w:r/>
+      <w:r>
+        <w:rPr>
+          <w:rFonts w:ascii="Times New Roman" w:hAnsi="Times New Roman" w:eastAsia="Times New Roman"/>
+          <w:sz w:val="24"/>
+        </w:rPr>
+        <w:t>Vitória da Conquista – BA</w:t>
+      </w:r>
+    </w:p>
+    <w:p>
+      <w:pPr>
+        <w:spacing w:line="240" w:lineRule="auto"/>
+        <w:jc w:val="center"/>
+      </w:pPr>
+      <w:r>
+        <w:rPr>
+          <w:rFonts w:ascii="Times New Roman" w:hAnsi="Times New Roman" w:eastAsia="Times New Roman"/>
+          <w:sz w:val="24"/>
+        </w:rPr>
+        <w:t>Agosto de 2026</w:t>
       </w:r>
     </w:p>
     <w:p>
@@ -108,52 +159,71 @@
     <w:p>
       <w:pPr>
         <w:pStyle w:val="Heading1"/>
-        <w:spacing w:after="160" w:before="320"/>
-      </w:pPr>
-      <w:r>
-        <w:rPr>
+        <w:spacing w:after="120" w:before="240" w:line="360" w:lineRule="auto"/>
+      </w:pPr>
+      <w:r>
+        <w:rPr>
+          <w:rFonts w:ascii="Times New Roman" w:hAnsi="Times New Roman" w:eastAsia="Times New Roman"/>
           <w:b/>
           <w:bCs/>
           <w:color w:val="1A4971"/>
+          <w:sz w:val="24"/>
         </w:rPr>
         <w:t xml:space="preserve">1. Introdução</w:t>
       </w:r>
     </w:p>
     <w:p>
       <w:pPr>
-        <w:spacing w:after="160" w:line="300"/>
-      </w:pPr>
-      <w:r>
+        <w:spacing w:after="120" w:line="360" w:lineRule="auto"/>
+        <w:jc w:val="both"/>
+      </w:pPr>
+      <w:r>
+        <w:rPr>
+          <w:rFonts w:ascii="Times New Roman" w:hAnsi="Times New Roman" w:eastAsia="Times New Roman"/>
+          <w:sz w:val="24"/>
+        </w:rPr>
         <w:t>Este relatório descreve a implementação de um sistema de chat cliente-servidor desenvolvido para a disciplina de Redes de Computadores II. O sistema permite que múltiplos clientes se conectem simultaneamente a um servidor central, troquem mensagens em modo de conversa geral (broadcast) e em conversas privadas, sejam notificados sobre a entrada e saída de outros usuários e consultem a lista de usuários conectados no momento. Além dos requisitos obrigatórios, foram implementados três itens opcionais do enunciado: interface gráfica (Tkinter, tanto para o cliente quanto para o servidor), persistência do histórico de mensagens em banco de dados SQLite, e criação de salas/canais temáticos.</w:t>
       </w:r>
     </w:p>
     <w:p>
       <w:pPr>
-        <w:spacing w:after="160" w:line="300"/>
-      </w:pPr>
-      <w:r>
+        <w:spacing w:after="120" w:line="360" w:lineRule="auto"/>
+        <w:jc w:val="both"/>
+      </w:pPr>
+      <w:r>
+        <w:rPr>
+          <w:rFonts w:ascii="Times New Roman" w:hAnsi="Times New Roman" w:eastAsia="Times New Roman"/>
+          <w:sz w:val="24"/>
+        </w:rPr>
         <w:t xml:space="preserve">A solução foi implementada em Python 3, utilizando exclusivamente a biblioteca padrão da linguagem (módulos socket, threading e json), sem o uso de bibliotecas prontas de chat, conforme exigido pelo enunciado. Toda a comunicação entre cliente e servidor ocorre via sockets TCP manualmente programados.</w:t>
       </w:r>
     </w:p>
     <w:p>
       <w:pPr>
         <w:pStyle w:val="Heading1"/>
-        <w:spacing w:after="160" w:before="320"/>
-      </w:pPr>
-      <w:r>
-        <w:rPr>
+        <w:spacing w:after="120" w:before="240" w:line="360" w:lineRule="auto"/>
+      </w:pPr>
+      <w:r>
+        <w:rPr>
+          <w:rFonts w:ascii="Times New Roman" w:hAnsi="Times New Roman" w:eastAsia="Times New Roman"/>
           <w:b/>
           <w:bCs/>
           <w:color w:val="1A4971"/>
+          <w:sz w:val="24"/>
         </w:rPr>
         <w:t xml:space="preserve">2. Arquitetura da Solução</w:t>
       </w:r>
     </w:p>
     <w:p>
       <w:pPr>
-        <w:spacing w:after="160" w:line="300"/>
-      </w:pPr>
-      <w:r>
+        <w:spacing w:after="120" w:line="360" w:lineRule="auto"/>
+        <w:jc w:val="both"/>
+      </w:pPr>
+      <w:r>
+        <w:rPr>
+          <w:rFonts w:ascii="Times New Roman" w:hAnsi="Times New Roman" w:eastAsia="Times New Roman"/>
+          <w:sz w:val="24"/>
+        </w:rPr>
         <w:t xml:space="preserve">A arquitetura segue o modelo clássico cliente-servidor centralizado: um único processo servidor gerencia todas as conexões e é responsável por rotear as mensagens entre os clientes. Cada cliente mantém uma única conexão TCP persistente com o servidor durante toda a sessão de chat.</w:t>
       </w:r>
     </w:p>
@@ -205,14 +275,16 @@
     </w:p>
     <w:p>
       <w:pPr>
-        <w:spacing w:after="160" w:line="300"/>
-      </w:pPr>
-      <w:r>
-        <w:rPr>
+        <w:spacing w:after="160" w:line="240" w:lineRule="auto"/>
+        <w:jc w:val="center"/>
+      </w:pPr>
+      <w:r>
+        <w:rPr>
+          <w:rFonts w:ascii="Times New Roman" w:hAnsi="Times New Roman" w:eastAsia="Times New Roman"/>
           <w:i/>
           <w:iCs/>
           <w:color w:val="4A5568"/>
-          <w:sz w:val="18"/>
+          <w:sz w:val="20"/>
           <w:szCs w:val="18"/>
         </w:rPr>
         <w:t xml:space="preserve">Diagrama 1 — Arquitetura de comunicação: cada cliente estabelece uma conexão TCP independente com o servidor, que centraliza o roteamento de todas as mensagens.</w:t>
@@ -221,13 +293,15 @@
     <w:p>
       <w:pPr>
         <w:pStyle w:val="Heading2"/>
-        <w:spacing w:after="120" w:before="240"/>
-      </w:pPr>
-      <w:r>
-        <w:rPr>
+        <w:spacing w:after="120" w:before="240" w:line="360" w:lineRule="auto"/>
+      </w:pPr>
+      <w:r>
+        <w:rPr>
+          <w:rFonts w:ascii="Times New Roman" w:hAnsi="Times New Roman" w:eastAsia="Times New Roman"/>
           <w:b/>
           <w:bCs/>
           <w:color w:val="2B6CB0"/>
+          <w:sz w:val="24"/>
         </w:rPr>
         <w:t xml:space="preserve">2.1 Servidor</w:t>
       </w:r>
@@ -239,9 +313,14 @@
           <w:ilvl w:val="0"/>
           <w:numId w:val="2"/>
         </w:numPr>
-        <w:spacing w:after="80"/>
-      </w:pPr>
-      <w:r>
+        <w:spacing w:after="120" w:line="360" w:lineRule="auto"/>
+        <w:jc w:val="both"/>
+      </w:pPr>
+      <w:r>
+        <w:rPr>
+          <w:rFonts w:ascii="Times New Roman" w:hAnsi="Times New Roman" w:eastAsia="Times New Roman"/>
+          <w:sz w:val="24"/>
+        </w:rPr>
         <w:t xml:space="preserve">Abre um socket TCP com bind() no endereço/porta configuráveis e entra em listen();</w:t>
       </w:r>
     </w:p>
@@ -252,9 +331,14 @@
           <w:ilvl w:val="0"/>
           <w:numId w:val="2"/>
         </w:numPr>
-        <w:spacing w:after="80"/>
-      </w:pPr>
-      <w:r>
+        <w:spacing w:after="120" w:line="360" w:lineRule="auto"/>
+        <w:jc w:val="both"/>
+      </w:pPr>
+      <w:r>
+        <w:rPr>
+          <w:rFonts w:ascii="Times New Roman" w:hAnsi="Times New Roman" w:eastAsia="Times New Roman"/>
+          <w:sz w:val="24"/>
+        </w:rPr>
         <w:t xml:space="preserve">Para cada conexão aceita (accept()), cria uma nova thread dedicada a esse cliente (threading.Thread), permitindo atender múltiplos clientes de forma concorrente;</w:t>
       </w:r>
     </w:p>
@@ -265,9 +349,14 @@
           <w:ilvl w:val="0"/>
           <w:numId w:val="2"/>
         </w:numPr>
-        <w:spacing w:after="80"/>
-      </w:pPr>
-      <w:r>
+        <w:spacing w:after="120" w:line="360" w:lineRule="auto"/>
+        <w:jc w:val="both"/>
+      </w:pPr>
+      <w:r>
+        <w:rPr>
+          <w:rFonts w:ascii="Times New Roman" w:hAnsi="Times New Roman" w:eastAsia="Times New Roman"/>
+          <w:sz w:val="24"/>
+        </w:rPr>
         <w:t xml:space="preserve">Mantém um dicionário compartilhado {apelido: cliente}, protegido por um threading.Lock, para consultas de listagem, broadcast e mensagens privadas com segurança entre threads;</w:t>
       </w:r>
     </w:p>
@@ -278,22 +367,29 @@
           <w:ilvl w:val="0"/>
           <w:numId w:val="2"/>
         </w:numPr>
-        <w:spacing w:after="80"/>
-      </w:pPr>
-      <w:r>
+        <w:spacing w:after="120" w:line="360" w:lineRule="auto"/>
+        <w:jc w:val="both"/>
+      </w:pPr>
+      <w:r>
+        <w:rPr>
+          <w:rFonts w:ascii="Times New Roman" w:hAnsi="Times New Roman" w:eastAsia="Times New Roman"/>
+          <w:sz w:val="24"/>
+        </w:rPr>
         <w:t>Cada thread de cliente fica em loop lendo mensagens do socket e as roteando conforme o tipo (MSG, PRIVADA, LISTAR, ENTRAR_SALA, LISTAR_SALAS, SAIR).</w:t>
       </w:r>
     </w:p>
     <w:p>
       <w:pPr>
         <w:pStyle w:val="Heading2"/>
-        <w:spacing w:after="120" w:before="240"/>
-      </w:pPr>
-      <w:r>
-        <w:rPr>
+        <w:spacing w:after="120" w:before="240" w:line="360" w:lineRule="auto"/>
+      </w:pPr>
+      <w:r>
+        <w:rPr>
+          <w:rFonts w:ascii="Times New Roman" w:hAnsi="Times New Roman" w:eastAsia="Times New Roman"/>
           <w:b/>
           <w:bCs/>
           <w:color w:val="2B6CB0"/>
+          <w:sz w:val="24"/>
         </w:rPr>
         <w:t xml:space="preserve">2.2 Cliente</w:t>
       </w:r>
@@ -305,9 +401,14 @@
           <w:ilvl w:val="0"/>
           <w:numId w:val="2"/>
         </w:numPr>
-        <w:spacing w:after="80"/>
-      </w:pPr>
-      <w:r>
+        <w:spacing w:after="120" w:line="360" w:lineRule="auto"/>
+        <w:jc w:val="both"/>
+      </w:pPr>
+      <w:r>
+        <w:rPr>
+          <w:rFonts w:ascii="Times New Roman" w:hAnsi="Times New Roman" w:eastAsia="Times New Roman"/>
+          <w:sz w:val="24"/>
+        </w:rPr>
         <w:t xml:space="preserve">Estabelece a conexão TCP com o servidor usando IP e porta informados por parâmetro de linha de comando ou digitados interativamente (nunca fixos no código);</w:t>
       </w:r>
     </w:p>
@@ -318,9 +419,14 @@
           <w:ilvl w:val="0"/>
           <w:numId w:val="2"/>
         </w:numPr>
-        <w:spacing w:after="80"/>
-      </w:pPr>
-      <w:r>
+        <w:spacing w:after="120" w:line="360" w:lineRule="auto"/>
+        <w:jc w:val="both"/>
+      </w:pPr>
+      <w:r>
+        <w:rPr>
+          <w:rFonts w:ascii="Times New Roman" w:hAnsi="Times New Roman" w:eastAsia="Times New Roman"/>
+          <w:sz w:val="24"/>
+        </w:rPr>
         <w:t xml:space="preserve">Usa duas threads: uma dedicada a receber mensagens do servidor a qualquer momento (thread de recepção) e a thread principal, que lê comandos do teclado e os envia (thread de envio); isso evita que a recepção de mensagens fique bloqueada enquanto o usuário digita;</w:t>
       </w:r>
     </w:p>
@@ -331,39 +437,56 @@
           <w:ilvl w:val="0"/>
           <w:numId w:val="2"/>
         </w:numPr>
-        <w:spacing w:after="80"/>
-      </w:pPr>
-      <w:r>
+        <w:spacing w:after="120" w:line="360" w:lineRule="auto"/>
+        <w:jc w:val="both"/>
+      </w:pPr>
+      <w:r>
+        <w:rPr>
+          <w:rFonts w:ascii="Times New Roman" w:hAnsi="Times New Roman" w:eastAsia="Times New Roman"/>
+          <w:sz w:val="24"/>
+        </w:rPr>
         <w:t xml:space="preserve">Interpreta comandos locais (/lista, /msg, /sair, /ajuda) e traduz texto livre em mensagens de broadcast.</w:t>
       </w:r>
     </w:p>
     <w:p>
       <w:pPr>
         <w:pStyle w:val="Heading1"/>
-        <w:spacing w:after="160" w:before="320"/>
-      </w:pPr>
-      <w:r>
-        <w:rPr>
+        <w:spacing w:after="120" w:before="240" w:line="360" w:lineRule="auto"/>
+      </w:pPr>
+      <w:r>
+        <w:rPr>
+          <w:rFonts w:ascii="Times New Roman" w:hAnsi="Times New Roman" w:eastAsia="Times New Roman"/>
           <w:b/>
           <w:bCs/>
           <w:color w:val="1A4971"/>
+          <w:sz w:val="24"/>
         </w:rPr>
         <w:t xml:space="preserve">3. Protocolo de Aplicação</w:t>
       </w:r>
     </w:p>
     <w:p>
       <w:pPr>
-        <w:spacing w:after="160" w:line="300"/>
-      </w:pPr>
-      <w:r>
+        <w:spacing w:after="120" w:line="360" w:lineRule="auto"/>
+        <w:jc w:val="both"/>
+      </w:pPr>
+      <w:r>
+        <w:rPr>
+          <w:rFonts w:ascii="Times New Roman" w:hAnsi="Times New Roman" w:eastAsia="Times New Roman"/>
+          <w:sz w:val="24"/>
+        </w:rPr>
         <w:t xml:space="preserve">Foi definido um protocolo de aplicação próprio sobre TCP, com serialização em JSON. Cada mensagem é um objeto JSON de uma única linha, seguido do caractere delimitador '\n'. Esse delimitador resolve o problema de fronteiras de mensagem: como o TCP entrega um fluxo contínuo de bytes (sem preservar limites entre envios distintos), o receptor acumula os dados recebidos em um buffer e extrai mensagens completas sempre que encontra o delimitador — mesmo que o socket tenha entregado várias mensagens juntas em uma única leitura, ou apenas parte de uma mensagem maior.</w:t>
       </w:r>
     </w:p>
     <w:p>
       <w:pPr>
-        <w:spacing w:after="160" w:line="300"/>
-      </w:pPr>
-      <w:r>
+        <w:spacing w:after="120" w:line="360" w:lineRule="auto"/>
+        <w:jc w:val="both"/>
+      </w:pPr>
+      <w:r>
+        <w:rPr>
+          <w:rFonts w:ascii="Times New Roman" w:hAnsi="Times New Roman" w:eastAsia="Times New Roman"/>
+          <w:sz w:val="24"/>
+        </w:rPr>
         <w:t xml:space="preserve">O uso de JSON (em vez de um formato binário) foi escolhido por ser nativamente suportado pela biblioteca padrão do Python, facilitar a depuração durante o desenvolvimento e permitir representar todos os tipos de mensagem com um único esquema: um campo "tipo" seguido dos campos específicos de cada operação.</w:t>
       </w:r>
     </w:p>
@@ -397,8 +520,12 @@
             </w:tcMar>
           </w:tcPr>
           <w:p>
-            <w:r>
-              <w:rPr>
+            <w:pPr>
+              <w:spacing w:line="240" w:lineRule="auto" w:after="40"/>
+            </w:pPr>
+            <w:r>
+              <w:rPr>
+                <w:rFonts w:ascii="Times New Roman" w:hAnsi="Times New Roman" w:eastAsia="Times New Roman"/>
                 <w:b/>
                 <w:bCs/>
                 <w:color w:val="FFFFFF"/>
@@ -421,8 +548,12 @@
             </w:tcMar>
           </w:tcPr>
           <w:p>
-            <w:r>
-              <w:rPr>
+            <w:pPr>
+              <w:spacing w:line="240" w:lineRule="auto" w:after="40"/>
+            </w:pPr>
+            <w:r>
+              <w:rPr>
+                <w:rFonts w:ascii="Times New Roman" w:hAnsi="Times New Roman" w:eastAsia="Times New Roman"/>
                 <w:b/>
                 <w:bCs/>
                 <w:color w:val="FFFFFF"/>
@@ -445,8 +576,12 @@
             </w:tcMar>
           </w:tcPr>
           <w:p>
-            <w:r>
-              <w:rPr>
+            <w:pPr>
+              <w:spacing w:line="240" w:lineRule="auto" w:after="40"/>
+            </w:pPr>
+            <w:r>
+              <w:rPr>
+                <w:rFonts w:ascii="Times New Roman" w:hAnsi="Times New Roman" w:eastAsia="Times New Roman"/>
                 <w:b/>
                 <w:bCs/>
                 <w:color w:val="FFFFFF"/>
@@ -470,9 +605,13 @@
             </w:tcMar>
           </w:tcPr>
           <w:p>
-            <w:r>
-              <w:rPr>
-                <w:b w:val="false"/>
+            <w:pPr>
+              <w:spacing w:line="240" w:lineRule="auto" w:after="40"/>
+            </w:pPr>
+            <w:r>
+              <w:rPr>
+                <w:rFonts w:ascii="Times New Roman" w:hAnsi="Times New Roman" w:eastAsia="Times New Roman"/>
+                <w:b w:val="0"/>
                 <w:bCs w:val="false"/>
                 <w:color w:val="000000"/>
                 <w:sz w:val="20"/>
@@ -493,9 +632,13 @@
             </w:tcMar>
           </w:tcPr>
           <w:p>
-            <w:r>
-              <w:rPr>
-                <w:b w:val="false"/>
+            <w:pPr>
+              <w:spacing w:line="240" w:lineRule="auto" w:after="40"/>
+            </w:pPr>
+            <w:r>
+              <w:rPr>
+                <w:rFonts w:ascii="Times New Roman" w:hAnsi="Times New Roman" w:eastAsia="Times New Roman"/>
+                <w:b w:val="0"/>
                 <w:bCs w:val="false"/>
                 <w:color w:val="000000"/>
                 <w:sz w:val="20"/>
@@ -516,9 +659,13 @@
             </w:tcMar>
           </w:tcPr>
           <w:p>
-            <w:r>
-              <w:rPr>
-                <w:b w:val="false"/>
+            <w:pPr>
+              <w:spacing w:line="240" w:lineRule="auto" w:after="40"/>
+            </w:pPr>
+            <w:r>
+              <w:rPr>
+                <w:rFonts w:ascii="Times New Roman" w:hAnsi="Times New Roman" w:eastAsia="Times New Roman"/>
+                <w:b w:val="0"/>
                 <w:bCs w:val="false"/>
                 <w:color w:val="000000"/>
                 <w:sz w:val="20"/>
@@ -541,9 +688,13 @@
             </w:tcMar>
           </w:tcPr>
           <w:p>
-            <w:r>
-              <w:rPr>
-                <w:b w:val="false"/>
+            <w:pPr>
+              <w:spacing w:line="240" w:lineRule="auto" w:after="40"/>
+            </w:pPr>
+            <w:r>
+              <w:rPr>
+                <w:rFonts w:ascii="Times New Roman" w:hAnsi="Times New Roman" w:eastAsia="Times New Roman"/>
+                <w:b w:val="0"/>
                 <w:bCs w:val="false"/>
                 <w:color w:val="000000"/>
                 <w:sz w:val="20"/>
@@ -564,9 +715,13 @@
             </w:tcMar>
           </w:tcPr>
           <w:p>
-            <w:r>
-              <w:rPr>
-                <w:b w:val="false"/>
+            <w:pPr>
+              <w:spacing w:line="240" w:lineRule="auto" w:after="40"/>
+            </w:pPr>
+            <w:r>
+              <w:rPr>
+                <w:rFonts w:ascii="Times New Roman" w:hAnsi="Times New Roman" w:eastAsia="Times New Roman"/>
+                <w:b w:val="0"/>
                 <w:bCs w:val="false"/>
                 <w:color w:val="000000"/>
                 <w:sz w:val="20"/>
@@ -587,9 +742,13 @@
             </w:tcMar>
           </w:tcPr>
           <w:p>
-            <w:r>
-              <w:rPr>
-                <w:b w:val="false"/>
+            <w:pPr>
+              <w:spacing w:line="240" w:lineRule="auto" w:after="40"/>
+            </w:pPr>
+            <w:r>
+              <w:rPr>
+                <w:rFonts w:ascii="Times New Roman" w:hAnsi="Times New Roman" w:eastAsia="Times New Roman"/>
+                <w:b w:val="0"/>
                 <w:bCs w:val="false"/>
                 <w:color w:val="000000"/>
                 <w:sz w:val="20"/>
@@ -612,9 +771,13 @@
             </w:tcMar>
           </w:tcPr>
           <w:p>
-            <w:r>
-              <w:rPr>
-                <w:b w:val="false"/>
+            <w:pPr>
+              <w:spacing w:line="240" w:lineRule="auto" w:after="40"/>
+            </w:pPr>
+            <w:r>
+              <w:rPr>
+                <w:rFonts w:ascii="Times New Roman" w:hAnsi="Times New Roman" w:eastAsia="Times New Roman"/>
+                <w:b w:val="0"/>
                 <w:bCs w:val="false"/>
                 <w:color w:val="000000"/>
                 <w:sz w:val="20"/>
@@ -635,9 +798,13 @@
             </w:tcMar>
           </w:tcPr>
           <w:p>
-            <w:r>
-              <w:rPr>
-                <w:b w:val="false"/>
+            <w:pPr>
+              <w:spacing w:line="240" w:lineRule="auto" w:after="40"/>
+            </w:pPr>
+            <w:r>
+              <w:rPr>
+                <w:rFonts w:ascii="Times New Roman" w:hAnsi="Times New Roman" w:eastAsia="Times New Roman"/>
+                <w:b w:val="0"/>
                 <w:bCs w:val="false"/>
                 <w:color w:val="000000"/>
                 <w:sz w:val="20"/>
@@ -658,9 +825,13 @@
             </w:tcMar>
           </w:tcPr>
           <w:p>
-            <w:r>
-              <w:rPr>
-                <w:b w:val="false"/>
+            <w:pPr>
+              <w:spacing w:line="240" w:lineRule="auto" w:after="40"/>
+            </w:pPr>
+            <w:r>
+              <w:rPr>
+                <w:rFonts w:ascii="Times New Roman" w:hAnsi="Times New Roman" w:eastAsia="Times New Roman"/>
+                <w:b w:val="0"/>
                 <w:bCs w:val="false"/>
                 <w:color w:val="000000"/>
                 <w:sz w:val="20"/>
@@ -683,9 +854,13 @@
             </w:tcMar>
           </w:tcPr>
           <w:p>
-            <w:r>
-              <w:rPr>
-                <w:b w:val="false"/>
+            <w:pPr>
+              <w:spacing w:line="240" w:lineRule="auto" w:after="40"/>
+            </w:pPr>
+            <w:r>
+              <w:rPr>
+                <w:rFonts w:ascii="Times New Roman" w:hAnsi="Times New Roman" w:eastAsia="Times New Roman"/>
+                <w:b w:val="0"/>
                 <w:bCs w:val="false"/>
                 <w:color w:val="000000"/>
                 <w:sz w:val="20"/>
@@ -706,9 +881,13 @@
             </w:tcMar>
           </w:tcPr>
           <w:p>
-            <w:r>
-              <w:rPr>
-                <w:b w:val="false"/>
+            <w:pPr>
+              <w:spacing w:line="240" w:lineRule="auto" w:after="40"/>
+            </w:pPr>
+            <w:r>
+              <w:rPr>
+                <w:rFonts w:ascii="Times New Roman" w:hAnsi="Times New Roman" w:eastAsia="Times New Roman"/>
+                <w:b w:val="0"/>
                 <w:bCs w:val="false"/>
                 <w:color w:val="000000"/>
                 <w:sz w:val="20"/>
@@ -729,9 +908,13 @@
             </w:tcMar>
           </w:tcPr>
           <w:p>
-            <w:r>
-              <w:rPr>
-                <w:b w:val="false"/>
+            <w:pPr>
+              <w:spacing w:line="240" w:lineRule="auto" w:after="40"/>
+            </w:pPr>
+            <w:r>
+              <w:rPr>
+                <w:rFonts w:ascii="Times New Roman" w:hAnsi="Times New Roman" w:eastAsia="Times New Roman"/>
+                <w:b w:val="0"/>
                 <w:bCs w:val="false"/>
                 <w:color w:val="000000"/>
                 <w:sz w:val="20"/>
@@ -754,9 +937,13 @@
             </w:tcMar>
           </w:tcPr>
           <w:p>
-            <w:r>
-              <w:rPr>
-                <w:b w:val="false"/>
+            <w:pPr>
+              <w:spacing w:line="240" w:lineRule="auto" w:after="40"/>
+            </w:pPr>
+            <w:r>
+              <w:rPr>
+                <w:rFonts w:ascii="Times New Roman" w:hAnsi="Times New Roman" w:eastAsia="Times New Roman"/>
+                <w:b w:val="0"/>
                 <w:bCs w:val="false"/>
                 <w:color w:val="000000"/>
                 <w:sz w:val="20"/>
@@ -777,9 +964,13 @@
             </w:tcMar>
           </w:tcPr>
           <w:p>
-            <w:r>
-              <w:rPr>
-                <w:b w:val="false"/>
+            <w:pPr>
+              <w:spacing w:line="240" w:lineRule="auto" w:after="40"/>
+            </w:pPr>
+            <w:r>
+              <w:rPr>
+                <w:rFonts w:ascii="Times New Roman" w:hAnsi="Times New Roman" w:eastAsia="Times New Roman"/>
+                <w:b w:val="0"/>
                 <w:bCs w:val="false"/>
                 <w:color w:val="000000"/>
                 <w:sz w:val="20"/>
@@ -800,9 +991,13 @@
             </w:tcMar>
           </w:tcPr>
           <w:p>
-            <w:r>
-              <w:rPr>
-                <w:b w:val="false"/>
+            <w:pPr>
+              <w:spacing w:line="240" w:lineRule="auto" w:after="40"/>
+            </w:pPr>
+            <w:r>
+              <w:rPr>
+                <w:rFonts w:ascii="Times New Roman" w:hAnsi="Times New Roman" w:eastAsia="Times New Roman"/>
+                <w:b w:val="0"/>
                 <w:bCs w:val="false"/>
                 <w:color w:val="000000"/>
                 <w:sz w:val="20"/>
@@ -825,9 +1020,13 @@
             </w:tcMar>
           </w:tcPr>
           <w:p>
-            <w:r>
-              <w:rPr>
-                <w:b w:val="false"/>
+            <w:pPr>
+              <w:spacing w:line="240" w:lineRule="auto" w:after="40"/>
+            </w:pPr>
+            <w:r>
+              <w:rPr>
+                <w:rFonts w:ascii="Times New Roman" w:hAnsi="Times New Roman" w:eastAsia="Times New Roman"/>
+                <w:b w:val="0"/>
                 <w:bCs w:val="false"/>
                 <w:color w:val="000000"/>
                 <w:sz w:val="20"/>
@@ -848,9 +1047,13 @@
             </w:tcMar>
           </w:tcPr>
           <w:p>
-            <w:r>
-              <w:rPr>
-                <w:b w:val="false"/>
+            <w:pPr>
+              <w:spacing w:line="240" w:lineRule="auto" w:after="40"/>
+            </w:pPr>
+            <w:r>
+              <w:rPr>
+                <w:rFonts w:ascii="Times New Roman" w:hAnsi="Times New Roman" w:eastAsia="Times New Roman"/>
+                <w:b w:val="0"/>
                 <w:bCs w:val="false"/>
                 <w:color w:val="000000"/>
                 <w:sz w:val="20"/>
@@ -871,9 +1074,13 @@
             </w:tcMar>
           </w:tcPr>
           <w:p>
-            <w:r>
-              <w:rPr>
-                <w:b w:val="false"/>
+            <w:pPr>
+              <w:spacing w:line="240" w:lineRule="auto" w:after="40"/>
+            </w:pPr>
+            <w:r>
+              <w:rPr>
+                <w:rFonts w:ascii="Times New Roman" w:hAnsi="Times New Roman" w:eastAsia="Times New Roman"/>
+                <w:b w:val="0"/>
                 <w:bCs w:val="false"/>
                 <w:color w:val="000000"/>
                 <w:sz w:val="20"/>
@@ -896,9 +1103,13 @@
             </w:tcMar>
           </w:tcPr>
           <w:p>
-            <w:r>
-              <w:rPr>
-                <w:b w:val="false"/>
+            <w:pPr>
+              <w:spacing w:line="240" w:lineRule="auto" w:after="40"/>
+            </w:pPr>
+            <w:r>
+              <w:rPr>
+                <w:rFonts w:ascii="Times New Roman" w:hAnsi="Times New Roman" w:eastAsia="Times New Roman"/>
+                <w:b w:val="0"/>
                 <w:bCs w:val="false"/>
                 <w:color w:val="000000"/>
                 <w:sz w:val="20"/>
@@ -919,9 +1130,13 @@
             </w:tcMar>
           </w:tcPr>
           <w:p>
-            <w:r>
-              <w:rPr>
-                <w:b w:val="false"/>
+            <w:pPr>
+              <w:spacing w:line="240" w:lineRule="auto" w:after="40"/>
+            </w:pPr>
+            <w:r>
+              <w:rPr>
+                <w:rFonts w:ascii="Times New Roman" w:hAnsi="Times New Roman" w:eastAsia="Times New Roman"/>
+                <w:b w:val="0"/>
                 <w:bCs w:val="false"/>
                 <w:color w:val="000000"/>
                 <w:sz w:val="20"/>
@@ -942,9 +1157,13 @@
             </w:tcMar>
           </w:tcPr>
           <w:p>
-            <w:r>
-              <w:rPr>
-                <w:b w:val="false"/>
+            <w:pPr>
+              <w:spacing w:line="240" w:lineRule="auto" w:after="40"/>
+            </w:pPr>
+            <w:r>
+              <w:rPr>
+                <w:rFonts w:ascii="Times New Roman" w:hAnsi="Times New Roman" w:eastAsia="Times New Roman"/>
+                <w:b w:val="0"/>
                 <w:bCs w:val="false"/>
                 <w:color w:val="000000"/>
                 <w:sz w:val="20"/>
@@ -967,9 +1186,13 @@
             </w:tcMar>
           </w:tcPr>
           <w:p>
-            <w:r>
-              <w:rPr>
-                <w:b w:val="false"/>
+            <w:pPr>
+              <w:spacing w:line="240" w:lineRule="auto" w:after="40"/>
+            </w:pPr>
+            <w:r>
+              <w:rPr>
+                <w:rFonts w:ascii="Times New Roman" w:hAnsi="Times New Roman" w:eastAsia="Times New Roman"/>
+                <w:b w:val="0"/>
                 <w:bCs w:val="false"/>
                 <w:color w:val="000000"/>
                 <w:sz w:val="20"/>
@@ -990,9 +1213,13 @@
             </w:tcMar>
           </w:tcPr>
           <w:p>
-            <w:r>
-              <w:rPr>
-                <w:b w:val="false"/>
+            <w:pPr>
+              <w:spacing w:line="240" w:lineRule="auto" w:after="40"/>
+            </w:pPr>
+            <w:r>
+              <w:rPr>
+                <w:rFonts w:ascii="Times New Roman" w:hAnsi="Times New Roman" w:eastAsia="Times New Roman"/>
+                <w:b w:val="0"/>
                 <w:bCs w:val="false"/>
                 <w:color w:val="000000"/>
                 <w:sz w:val="20"/>
@@ -1013,9 +1240,13 @@
             </w:tcMar>
           </w:tcPr>
           <w:p>
-            <w:r>
-              <w:rPr>
-                <w:b w:val="false"/>
+            <w:pPr>
+              <w:spacing w:line="240" w:lineRule="auto" w:after="40"/>
+            </w:pPr>
+            <w:r>
+              <w:rPr>
+                <w:rFonts w:ascii="Times New Roman" w:hAnsi="Times New Roman" w:eastAsia="Times New Roman"/>
+                <w:b w:val="0"/>
                 <w:bCs w:val="false"/>
                 <w:color w:val="000000"/>
                 <w:sz w:val="20"/>
@@ -1038,9 +1269,13 @@
             </w:tcMar>
           </w:tcPr>
           <w:p>
-            <w:r>
-              <w:rPr>
-                <w:b w:val="false"/>
+            <w:pPr>
+              <w:spacing w:line="240" w:lineRule="auto" w:after="40"/>
+            </w:pPr>
+            <w:r>
+              <w:rPr>
+                <w:rFonts w:ascii="Times New Roman" w:hAnsi="Times New Roman" w:eastAsia="Times New Roman"/>
+                <w:b w:val="0"/>
                 <w:bCs w:val="false"/>
                 <w:color w:val="000000"/>
                 <w:sz w:val="20"/>
@@ -1061,9 +1296,13 @@
             </w:tcMar>
           </w:tcPr>
           <w:p>
-            <w:r>
-              <w:rPr>
-                <w:b w:val="false"/>
+            <w:pPr>
+              <w:spacing w:line="240" w:lineRule="auto" w:after="40"/>
+            </w:pPr>
+            <w:r>
+              <w:rPr>
+                <w:rFonts w:ascii="Times New Roman" w:hAnsi="Times New Roman" w:eastAsia="Times New Roman"/>
+                <w:b w:val="0"/>
                 <w:bCs w:val="false"/>
                 <w:color w:val="000000"/>
                 <w:sz w:val="20"/>
@@ -1084,9 +1323,13 @@
             </w:tcMar>
           </w:tcPr>
           <w:p>
-            <w:r>
-              <w:rPr>
-                <w:b w:val="false"/>
+            <w:pPr>
+              <w:spacing w:line="240" w:lineRule="auto" w:after="40"/>
+            </w:pPr>
+            <w:r>
+              <w:rPr>
+                <w:rFonts w:ascii="Times New Roman" w:hAnsi="Times New Roman" w:eastAsia="Times New Roman"/>
+                <w:b w:val="0"/>
                 <w:bCs w:val="false"/>
                 <w:color w:val="000000"/>
                 <w:sz w:val="20"/>
@@ -1109,9 +1352,13 @@
             </w:tcMar>
           </w:tcPr>
           <w:p>
-            <w:r>
-              <w:rPr>
-                <w:b w:val="false"/>
+            <w:pPr>
+              <w:spacing w:line="240" w:lineRule="auto" w:after="40"/>
+            </w:pPr>
+            <w:r>
+              <w:rPr>
+                <w:rFonts w:ascii="Times New Roman" w:hAnsi="Times New Roman" w:eastAsia="Times New Roman"/>
+                <w:b w:val="0"/>
                 <w:bCs w:val="false"/>
                 <w:color w:val="000000"/>
                 <w:sz w:val="20"/>
@@ -1132,9 +1379,13 @@
             </w:tcMar>
           </w:tcPr>
           <w:p>
-            <w:r>
-              <w:rPr>
-                <w:b w:val="false"/>
+            <w:pPr>
+              <w:spacing w:line="240" w:lineRule="auto" w:after="40"/>
+            </w:pPr>
+            <w:r>
+              <w:rPr>
+                <w:rFonts w:ascii="Times New Roman" w:hAnsi="Times New Roman" w:eastAsia="Times New Roman"/>
+                <w:b w:val="0"/>
                 <w:bCs w:val="false"/>
                 <w:color w:val="000000"/>
                 <w:sz w:val="20"/>
@@ -1155,9 +1406,13 @@
             </w:tcMar>
           </w:tcPr>
           <w:p>
-            <w:r>
-              <w:rPr>
-                <w:b w:val="false"/>
+            <w:pPr>
+              <w:spacing w:line="240" w:lineRule="auto" w:after="40"/>
+            </w:pPr>
+            <w:r>
+              <w:rPr>
+                <w:rFonts w:ascii="Times New Roman" w:hAnsi="Times New Roman" w:eastAsia="Times New Roman"/>
+                <w:b w:val="0"/>
                 <w:bCs w:val="false"/>
                 <w:color w:val="000000"/>
                 <w:sz w:val="20"/>
@@ -1180,9 +1435,13 @@
             </w:tcMar>
           </w:tcPr>
           <w:p>
-            <w:r>
-              <w:rPr>
-                <w:b w:val="false"/>
+            <w:pPr>
+              <w:spacing w:line="240" w:lineRule="auto" w:after="40"/>
+            </w:pPr>
+            <w:r>
+              <w:rPr>
+                <w:rFonts w:ascii="Times New Roman" w:hAnsi="Times New Roman" w:eastAsia="Times New Roman"/>
+                <w:b w:val="0"/>
                 <w:bCs w:val="false"/>
                 <w:color w:val="000000"/>
                 <w:sz w:val="20"/>
@@ -1203,9 +1462,13 @@
             </w:tcMar>
           </w:tcPr>
           <w:p>
-            <w:r>
-              <w:rPr>
-                <w:b w:val="false"/>
+            <w:pPr>
+              <w:spacing w:line="240" w:lineRule="auto" w:after="40"/>
+            </w:pPr>
+            <w:r>
+              <w:rPr>
+                <w:rFonts w:ascii="Times New Roman" w:hAnsi="Times New Roman" w:eastAsia="Times New Roman"/>
+                <w:b w:val="0"/>
                 <w:bCs w:val="false"/>
                 <w:color w:val="000000"/>
                 <w:sz w:val="20"/>
@@ -1226,9 +1489,13 @@
             </w:tcMar>
           </w:tcPr>
           <w:p>
-            <w:r>
-              <w:rPr>
-                <w:b w:val="false"/>
+            <w:pPr>
+              <w:spacing w:line="240" w:lineRule="auto" w:after="40"/>
+            </w:pPr>
+            <w:r>
+              <w:rPr>
+                <w:rFonts w:ascii="Times New Roman" w:hAnsi="Times New Roman" w:eastAsia="Times New Roman"/>
+                <w:b w:val="0"/>
                 <w:bCs w:val="false"/>
                 <w:color w:val="000000"/>
                 <w:sz w:val="20"/>
@@ -1251,9 +1518,13 @@
             </w:tcMar>
           </w:tcPr>
           <w:p>
-            <w:r>
-              <w:rPr>
-                <w:b w:val="false"/>
+            <w:pPr>
+              <w:spacing w:line="240" w:lineRule="auto" w:after="40"/>
+            </w:pPr>
+            <w:r>
+              <w:rPr>
+                <w:rFonts w:ascii="Times New Roman" w:hAnsi="Times New Roman" w:eastAsia="Times New Roman"/>
+                <w:b w:val="0"/>
                 <w:bCs w:val="false"/>
                 <w:color w:val="000000"/>
                 <w:sz w:val="20"/>
@@ -1274,9 +1545,13 @@
             </w:tcMar>
           </w:tcPr>
           <w:p>
-            <w:r>
-              <w:rPr>
-                <w:b w:val="false"/>
+            <w:pPr>
+              <w:spacing w:line="240" w:lineRule="auto" w:after="40"/>
+            </w:pPr>
+            <w:r>
+              <w:rPr>
+                <w:rFonts w:ascii="Times New Roman" w:hAnsi="Times New Roman" w:eastAsia="Times New Roman"/>
+                <w:b w:val="0"/>
                 <w:bCs w:val="false"/>
                 <w:color w:val="000000"/>
                 <w:sz w:val="20"/>
@@ -1297,15 +1572,443 @@
             </w:tcMar>
           </w:tcPr>
           <w:p>
-            <w:r>
-              <w:rPr>
-                <w:b w:val="false"/>
+            <w:pPr>
+              <w:spacing w:line="240" w:lineRule="auto" w:after="40"/>
+            </w:pPr>
+            <w:r>
+              <w:rPr>
+                <w:rFonts w:ascii="Times New Roman" w:hAnsi="Times New Roman" w:eastAsia="Times New Roman"/>
+                <w:b w:val="0"/>
                 <w:bCs w:val="false"/>
                 <w:color w:val="000000"/>
                 <w:sz w:val="20"/>
                 <w:szCs w:val="20"/>
               </w:rPr>
               <w:t xml:space="preserve">{ mensagem }  —  erro genérico (comando inválido, destino inexistente etc.)</w:t>
+            </w:r>
+          </w:p>
+        </w:tc>
+      </w:tr>
+      <w:tr>
+        <w:tc>
+          <w:tcPr>
+            <w:tcW w:type="dxa" w:w="2000"/>
+          </w:tcPr>
+          <w:p>
+            <w:pPr>
+              <w:spacing w:line="240" w:lineRule="auto" w:after="40"/>
+            </w:pPr>
+            <w:r>
+              <w:rPr>
+                <w:rFonts w:ascii="Times New Roman" w:hAnsi="Times New Roman" w:eastAsia="Times New Roman"/>
+                <w:sz w:val="20"/>
+              </w:rPr>
+              <w:t>Cliente → Servidor</w:t>
+            </w:r>
+          </w:p>
+        </w:tc>
+        <w:tc>
+          <w:tcPr>
+            <w:tcW w:type="dxa" w:w="2350"/>
+          </w:tcPr>
+          <w:p>
+            <w:pPr>
+              <w:spacing w:line="240" w:lineRule="auto" w:after="40"/>
+            </w:pPr>
+            <w:r>
+              <w:rPr>
+                <w:rFonts w:ascii="Times New Roman" w:hAnsi="Times New Roman" w:eastAsia="Times New Roman"/>
+                <w:sz w:val="20"/>
+              </w:rPr>
+              <w:t>ENTRAR_SALA</w:t>
+            </w:r>
+          </w:p>
+        </w:tc>
+        <w:tc>
+          <w:tcPr>
+            <w:tcW w:type="dxa" w:w="5000"/>
+          </w:tcPr>
+          <w:p>
+            <w:pPr>
+              <w:spacing w:line="240" w:lineRule="auto" w:after="40"/>
+            </w:pPr>
+            <w:r>
+              <w:rPr>
+                <w:rFonts w:ascii="Times New Roman" w:hAnsi="Times New Roman" w:eastAsia="Times New Roman"/>
+                <w:sz w:val="20"/>
+              </w:rPr>
+              <w:t>{ sala }  —  troca para outra sala/canal (cria se não existir)</w:t>
+            </w:r>
+          </w:p>
+        </w:tc>
+      </w:tr>
+      <w:tr>
+        <w:tc>
+          <w:tcPr>
+            <w:tcW w:type="dxa" w:w="2000"/>
+          </w:tcPr>
+          <w:p>
+            <w:pPr>
+              <w:spacing w:line="240" w:lineRule="auto" w:after="40"/>
+            </w:pPr>
+            <w:r>
+              <w:rPr>
+                <w:rFonts w:ascii="Times New Roman" w:hAnsi="Times New Roman" w:eastAsia="Times New Roman"/>
+                <w:sz w:val="20"/>
+              </w:rPr>
+              <w:t>Cliente → Servidor</w:t>
+            </w:r>
+          </w:p>
+        </w:tc>
+        <w:tc>
+          <w:tcPr>
+            <w:tcW w:type="dxa" w:w="2350"/>
+          </w:tcPr>
+          <w:p>
+            <w:pPr>
+              <w:spacing w:line="240" w:lineRule="auto" w:after="40"/>
+            </w:pPr>
+            <w:r>
+              <w:rPr>
+                <w:rFonts w:ascii="Times New Roman" w:hAnsi="Times New Roman" w:eastAsia="Times New Roman"/>
+                <w:sz w:val="20"/>
+              </w:rPr>
+              <w:t>LISTAR_SALAS</w:t>
+            </w:r>
+          </w:p>
+        </w:tc>
+        <w:tc>
+          <w:tcPr>
+            <w:tcW w:type="dxa" w:w="5000"/>
+          </w:tcPr>
+          <w:p>
+            <w:pPr>
+              <w:spacing w:line="240" w:lineRule="auto" w:after="40"/>
+            </w:pPr>
+            <w:r>
+              <w:rPr>
+                <w:rFonts w:ascii="Times New Roman" w:hAnsi="Times New Roman" w:eastAsia="Times New Roman"/>
+                <w:sz w:val="20"/>
+              </w:rPr>
+              <w:t>solicita a lista de salas ativas no momento</w:t>
+            </w:r>
+          </w:p>
+        </w:tc>
+      </w:tr>
+      <w:tr>
+        <w:tc>
+          <w:tcPr>
+            <w:tcW w:type="dxa" w:w="2000"/>
+          </w:tcPr>
+          <w:p>
+            <w:pPr>
+              <w:spacing w:line="240" w:lineRule="auto" w:after="40"/>
+            </w:pPr>
+            <w:r>
+              <w:rPr>
+                <w:rFonts w:ascii="Times New Roman" w:hAnsi="Times New Roman" w:eastAsia="Times New Roman"/>
+                <w:sz w:val="20"/>
+              </w:rPr>
+              <w:t>Cliente → Servidor</w:t>
+            </w:r>
+          </w:p>
+        </w:tc>
+        <w:tc>
+          <w:tcPr>
+            <w:tcW w:type="dxa" w:w="2350"/>
+          </w:tcPr>
+          <w:p>
+            <w:pPr>
+              <w:spacing w:line="240" w:lineRule="auto" w:after="40"/>
+            </w:pPr>
+            <w:r>
+              <w:rPr>
+                <w:rFonts w:ascii="Times New Roman" w:hAnsi="Times New Roman" w:eastAsia="Times New Roman"/>
+                <w:sz w:val="20"/>
+              </w:rPr>
+              <w:t>DIGITANDO</w:t>
+            </w:r>
+          </w:p>
+        </w:tc>
+        <w:tc>
+          <w:tcPr>
+            <w:tcW w:type="dxa" w:w="5000"/>
+          </w:tcPr>
+          <w:p>
+            <w:pPr>
+              <w:spacing w:line="240" w:lineRule="auto" w:after="40"/>
+            </w:pPr>
+            <w:r>
+              <w:rPr>
+                <w:rFonts w:ascii="Times New Roman" w:hAnsi="Times New Roman" w:eastAsia="Times New Roman"/>
+                <w:sz w:val="20"/>
+              </w:rPr>
+              <w:t>{ destino (opcional) }  —  avisa que o remetente está digitando</w:t>
+            </w:r>
+          </w:p>
+        </w:tc>
+      </w:tr>
+      <w:tr>
+        <w:tc>
+          <w:tcPr>
+            <w:tcW w:type="dxa" w:w="2000"/>
+          </w:tcPr>
+          <w:p>
+            <w:pPr>
+              <w:spacing w:line="240" w:lineRule="auto" w:after="40"/>
+            </w:pPr>
+            <w:r>
+              <w:rPr>
+                <w:rFonts w:ascii="Times New Roman" w:hAnsi="Times New Roman" w:eastAsia="Times New Roman"/>
+                <w:sz w:val="20"/>
+              </w:rPr>
+              <w:t>Servidor → Cliente</w:t>
+            </w:r>
+          </w:p>
+        </w:tc>
+        <w:tc>
+          <w:tcPr>
+            <w:tcW w:type="dxa" w:w="2350"/>
+          </w:tcPr>
+          <w:p>
+            <w:pPr>
+              <w:spacing w:line="240" w:lineRule="auto" w:after="40"/>
+            </w:pPr>
+            <w:r>
+              <w:rPr>
+                <w:rFonts w:ascii="Times New Roman" w:hAnsi="Times New Roman" w:eastAsia="Times New Roman"/>
+                <w:sz w:val="20"/>
+              </w:rPr>
+              <w:t>SALA_OK / SALA_ERRO</w:t>
+            </w:r>
+          </w:p>
+        </w:tc>
+        <w:tc>
+          <w:tcPr>
+            <w:tcW w:type="dxa" w:w="5000"/>
+          </w:tcPr>
+          <w:p>
+            <w:pPr>
+              <w:spacing w:line="240" w:lineRule="auto" w:after="40"/>
+            </w:pPr>
+            <w:r>
+              <w:rPr>
+                <w:rFonts w:ascii="Times New Roman" w:hAnsi="Times New Roman" w:eastAsia="Times New Roman"/>
+                <w:sz w:val="20"/>
+              </w:rPr>
+              <w:t>{ sala } / { motivo }  —  confirma ou recusa a troca de sala</w:t>
+            </w:r>
+          </w:p>
+        </w:tc>
+      </w:tr>
+      <w:tr>
+        <w:tc>
+          <w:tcPr>
+            <w:tcW w:type="dxa" w:w="2000"/>
+          </w:tcPr>
+          <w:p>
+            <w:pPr>
+              <w:spacing w:line="240" w:lineRule="auto" w:after="40"/>
+            </w:pPr>
+            <w:r>
+              <w:rPr>
+                <w:rFonts w:ascii="Times New Roman" w:hAnsi="Times New Roman" w:eastAsia="Times New Roman"/>
+                <w:sz w:val="20"/>
+              </w:rPr>
+              <w:t>Servidor → Cliente</w:t>
+            </w:r>
+          </w:p>
+        </w:tc>
+        <w:tc>
+          <w:tcPr>
+            <w:tcW w:type="dxa" w:w="2350"/>
+          </w:tcPr>
+          <w:p>
+            <w:pPr>
+              <w:spacing w:line="240" w:lineRule="auto" w:after="40"/>
+            </w:pPr>
+            <w:r>
+              <w:rPr>
+                <w:rFonts w:ascii="Times New Roman" w:hAnsi="Times New Roman" w:eastAsia="Times New Roman"/>
+                <w:sz w:val="20"/>
+              </w:rPr>
+              <w:t>LISTA_SALAS</w:t>
+            </w:r>
+          </w:p>
+        </w:tc>
+        <w:tc>
+          <w:tcPr>
+            <w:tcW w:type="dxa" w:w="5000"/>
+          </w:tcPr>
+          <w:p>
+            <w:pPr>
+              <w:spacing w:line="240" w:lineRule="auto" w:after="40"/>
+            </w:pPr>
+            <w:r>
+              <w:rPr>
+                <w:rFonts w:ascii="Times New Roman" w:hAnsi="Times New Roman" w:eastAsia="Times New Roman"/>
+                <w:sz w:val="20"/>
+              </w:rPr>
+              <w:t>{ salas: [...] }  —  resposta ao comando /salas</w:t>
+            </w:r>
+          </w:p>
+        </w:tc>
+      </w:tr>
+      <w:tr>
+        <w:tc>
+          <w:tcPr>
+            <w:tcW w:type="dxa" w:w="2000"/>
+          </w:tcPr>
+          <w:p>
+            <w:pPr>
+              <w:spacing w:line="240" w:lineRule="auto" w:after="40"/>
+            </w:pPr>
+            <w:r>
+              <w:rPr>
+                <w:rFonts w:ascii="Times New Roman" w:hAnsi="Times New Roman" w:eastAsia="Times New Roman"/>
+                <w:sz w:val="20"/>
+              </w:rPr>
+              <w:t>Servidor → Cliente</w:t>
+            </w:r>
+          </w:p>
+        </w:tc>
+        <w:tc>
+          <w:tcPr>
+            <w:tcW w:type="dxa" w:w="2350"/>
+          </w:tcPr>
+          <w:p>
+            <w:pPr>
+              <w:spacing w:line="240" w:lineRule="auto" w:after="40"/>
+            </w:pPr>
+            <w:r>
+              <w:rPr>
+                <w:rFonts w:ascii="Times New Roman" w:hAnsi="Times New Roman" w:eastAsia="Times New Roman"/>
+                <w:sz w:val="20"/>
+              </w:rPr>
+              <w:t>HISTORICO</w:t>
+            </w:r>
+          </w:p>
+        </w:tc>
+        <w:tc>
+          <w:tcPr>
+            <w:tcW w:type="dxa" w:w="5000"/>
+          </w:tcPr>
+          <w:p>
+            <w:pPr>
+              <w:spacing w:line="240" w:lineRule="auto" w:after="40"/>
+            </w:pPr>
+            <w:r>
+              <w:rPr>
+                <w:rFonts w:ascii="Times New Roman" w:hAnsi="Times New Roman" w:eastAsia="Times New Roman"/>
+                <w:sz w:val="20"/>
+              </w:rPr>
+              <w:t>{ sala (opcional), mensagens: [...] }  —  histórico de privadas ou de mensagens gerais perdidas</w:t>
+            </w:r>
+          </w:p>
+        </w:tc>
+      </w:tr>
+      <w:tr>
+        <w:tc>
+          <w:tcPr>
+            <w:tcW w:type="dxa" w:w="2000"/>
+          </w:tcPr>
+          <w:p>
+            <w:pPr>
+              <w:spacing w:line="240" w:lineRule="auto" w:after="40"/>
+            </w:pPr>
+            <w:r>
+              <w:rPr>
+                <w:rFonts w:ascii="Times New Roman" w:hAnsi="Times New Roman" w:eastAsia="Times New Roman"/>
+                <w:sz w:val="20"/>
+              </w:rPr>
+              <w:t>Servidor → Cliente</w:t>
+            </w:r>
+          </w:p>
+        </w:tc>
+        <w:tc>
+          <w:tcPr>
+            <w:tcW w:type="dxa" w:w="2350"/>
+          </w:tcPr>
+          <w:p>
+            <w:pPr>
+              <w:spacing w:line="240" w:lineRule="auto" w:after="40"/>
+            </w:pPr>
+            <w:r>
+              <w:rPr>
+                <w:rFonts w:ascii="Times New Roman" w:hAnsi="Times New Roman" w:eastAsia="Times New Roman"/>
+                <w:sz w:val="20"/>
+              </w:rPr>
+              <w:t>DIGITANDO</w:t>
+            </w:r>
+          </w:p>
+        </w:tc>
+        <w:tc>
+          <w:tcPr>
+            <w:tcW w:type="dxa" w:w="5000"/>
+          </w:tcPr>
+          <w:p>
+            <w:pPr>
+              <w:spacing w:line="240" w:lineRule="auto" w:after="40"/>
+            </w:pPr>
+            <w:r>
+              <w:rPr>
+                <w:rFonts w:ascii="Times New Roman" w:hAnsi="Times New Roman" w:eastAsia="Times New Roman"/>
+                <w:sz w:val="20"/>
+              </w:rPr>
+              <w:t>{ de, sala (opcional) }  —  repasse do aviso de digitação</w:t>
+            </w:r>
+          </w:p>
+        </w:tc>
+      </w:tr>
+      <w:tr>
+        <w:tc>
+          <w:tcPr>
+            <w:tcW w:type="dxa" w:w="2000"/>
+          </w:tcPr>
+          <w:p>
+            <w:pPr>
+              <w:spacing w:line="240" w:lineRule="auto" w:after="40"/>
+            </w:pPr>
+            <w:r>
+              <w:rPr>
+                <w:rFonts w:ascii="Times New Roman" w:hAnsi="Times New Roman" w:eastAsia="Times New Roman"/>
+                <w:sz w:val="20"/>
+              </w:rPr>
+              <w:t>Servidor → Cliente</w:t>
+            </w:r>
+          </w:p>
+        </w:tc>
+        <w:tc>
+          <w:tcPr>
+            <w:tcW w:type="dxa" w:w="2350"/>
+          </w:tcPr>
+          <w:p>
+            <w:pPr>
+              <w:spacing w:line="240" w:lineRule="auto" w:after="40"/>
+            </w:pPr>
+            <w:r>
+              <w:rPr>
+                <w:rFonts w:ascii="Times New Roman" w:hAnsi="Times New Roman" w:eastAsia="Times New Roman"/>
+                <w:sz w:val="20"/>
+              </w:rPr>
+              <w:t>SISTEMA</w:t>
+            </w:r>
+          </w:p>
+        </w:tc>
+        <w:tc>
+          <w:tcPr>
+            <w:tcW w:type="dxa" w:w="5000"/>
+          </w:tcPr>
+          <w:p>
+            <w:pPr>
+              <w:spacing w:line="240" w:lineRule="auto" w:after="40"/>
+            </w:pPr>
+            <w:r>
+              <w:rPr>
+                <w:rFonts w:ascii="Times New Roman" w:hAnsi="Times New Roman" w:eastAsia="Times New Roman"/>
+                <w:sz w:val="20"/>
+              </w:rPr>
+              <w:t>{ mensagem }  —  aviso informativo do servidor (ex.: boas-vindas)</w:t>
             </w:r>
           </w:p>
         </w:tc>
@@ -1319,13 +2022,15 @@
     <w:p>
       <w:pPr>
         <w:pStyle w:val="Heading2"/>
-        <w:spacing w:after="120" w:before="240"/>
-      </w:pPr>
-      <w:r>
-        <w:rPr>
+        <w:spacing w:after="120" w:before="240" w:line="360" w:lineRule="auto"/>
+      </w:pPr>
+      <w:r>
+        <w:rPr>
+          <w:rFonts w:ascii="Times New Roman" w:hAnsi="Times New Roman" w:eastAsia="Times New Roman"/>
           <w:b/>
           <w:bCs/>
           <w:color w:val="2B6CB0"/>
+          <w:sz w:val="24"/>
         </w:rPr>
         <w:t xml:space="preserve">3.1 Exemplo de troca de mensagens</w:t>
       </w:r>
@@ -1333,20 +2038,22 @@
     <w:p>
       <w:pPr>
         <w:shd w:fill="F1F1F1" w:val="clear"/>
-        <w:spacing w:after="160"/>
-      </w:pPr>
-      <w:r>
-        <w:rPr>
-          <w:rFonts w:ascii="Consolas" w:cs="Consolas" w:eastAsia="Consolas" w:hAnsi="Consolas"/>
-          <w:sz w:val="18"/>
+        <w:spacing w:after="120" w:line="240" w:lineRule="auto"/>
+        <w:ind w:left="1134"/>
+        <w:jc w:val="left"/>
+      </w:pPr>
+      <w:r>
+        <w:rPr>
+          <w:rFonts w:ascii="Courier New" w:cs="Consolas" w:eastAsia="Courier New" w:hAnsi="Courier New"/>
+          <w:sz w:val="20"/>
           <w:szCs w:val="18"/>
         </w:rPr>
         <w:t xml:space="preserve">Cliente A -&gt; Servidor:   {"tipo": "LOGIN", "usuario": "alice"}</w:t>
       </w:r>
       <w:r>
         <w:rPr>
-          <w:rFonts w:ascii="Consolas" w:cs="Consolas" w:eastAsia="Consolas" w:hAnsi="Consolas"/>
-          <w:sz w:val="18"/>
+          <w:rFonts w:ascii="Courier New" w:cs="Consolas" w:eastAsia="Courier New" w:hAnsi="Courier New"/>
+          <w:sz w:val="20"/>
           <w:szCs w:val="18"/>
         </w:rPr>
         <w:br/>
@@ -1354,8 +2061,8 @@
       </w:r>
       <w:r>
         <w:rPr>
-          <w:rFonts w:ascii="Consolas" w:cs="Consolas" w:eastAsia="Consolas" w:hAnsi="Consolas"/>
-          <w:sz w:val="18"/>
+          <w:rFonts w:ascii="Courier New" w:cs="Consolas" w:eastAsia="Courier New" w:hAnsi="Courier New"/>
+          <w:sz w:val="20"/>
           <w:szCs w:val="18"/>
         </w:rPr>
         <w:br/>
@@ -1363,8 +2070,8 @@
       </w:r>
       <w:r>
         <w:rPr>
-          <w:rFonts w:ascii="Consolas" w:cs="Consolas" w:eastAsia="Consolas" w:hAnsi="Consolas"/>
-          <w:sz w:val="18"/>
+          <w:rFonts w:ascii="Courier New" w:cs="Consolas" w:eastAsia="Courier New" w:hAnsi="Courier New"/>
+          <w:sz w:val="20"/>
           <w:szCs w:val="18"/>
         </w:rPr>
         <w:br/>
@@ -1372,8 +2079,8 @@
       </w:r>
       <w:r>
         <w:rPr>
-          <w:rFonts w:ascii="Consolas" w:cs="Consolas" w:eastAsia="Consolas" w:hAnsi="Consolas"/>
-          <w:sz w:val="18"/>
+          <w:rFonts w:ascii="Courier New" w:cs="Consolas" w:eastAsia="Courier New" w:hAnsi="Courier New"/>
+          <w:sz w:val="20"/>
           <w:szCs w:val="18"/>
         </w:rPr>
         <w:br/>
@@ -1381,8 +2088,8 @@
       </w:r>
       <w:r>
         <w:rPr>
-          <w:rFonts w:ascii="Consolas" w:cs="Consolas" w:eastAsia="Consolas" w:hAnsi="Consolas"/>
-          <w:sz w:val="18"/>
+          <w:rFonts w:ascii="Courier New" w:cs="Consolas" w:eastAsia="Courier New" w:hAnsi="Courier New"/>
+          <w:sz w:val="20"/>
           <w:szCs w:val="18"/>
         </w:rPr>
         <w:br/>
@@ -1392,31 +2099,66 @@
     <w:p>
       <w:pPr>
         <w:pStyle w:val="Heading2"/>
-      </w:pPr>
-      <w:r>
+        <w:spacing w:line="360" w:lineRule="auto" w:before="240" w:after="120"/>
+      </w:pPr>
+      <w:r>
+        <w:rPr>
+          <w:rFonts w:ascii="Times New Roman" w:hAnsi="Times New Roman" w:eastAsia="Times New Roman"/>
+          <w:b/>
+          <w:sz w:val="24"/>
+        </w:rPr>
         <w:t>3.2 Salas/canais temáticos (item opcional)</w:t>
       </w:r>
     </w:p>
     <w:p>
-      <w:r>
+      <w:pPr>
+        <w:spacing w:line="360" w:lineRule="auto" w:after="120"/>
+        <w:jc w:val="both"/>
+      </w:pPr>
+      <w:r>
+        <w:rPr>
+          <w:rFonts w:ascii="Times New Roman" w:hAnsi="Times New Roman" w:eastAsia="Times New Roman"/>
+          <w:sz w:val="24"/>
+        </w:rPr>
         <w:t>Além do chat geral único exigido pelo enunciado, o protocolo suporta múltiplas salas/canais temáticos. Todo cliente é colocado automaticamente na sala padrão "geral" ao fazer login, e pode trocar de sala a qualquer momento enviando {"tipo": "ENTRAR_SALA", "sala": "&lt;nome&gt;"}. As salas usam auto-criação, no mesmo espírito do auto-registro de apelidos: não há uma lista fixa de salas pré-cadastradas no servidor — a primeira pessoa a entrar em um nome de sala novo passa a existir a partir desse momento.</w:t>
       </w:r>
     </w:p>
     <w:p>
-      <w:r>
+      <w:pPr>
+        <w:spacing w:line="360" w:lineRule="auto" w:after="120"/>
+        <w:jc w:val="both"/>
+      </w:pPr>
+      <w:r>
+        <w:rPr>
+          <w:rFonts w:ascii="Times New Roman" w:hAnsi="Times New Roman" w:eastAsia="Times New Roman"/>
+          <w:sz w:val="24"/>
+        </w:rPr>
         <w:t>O servidor guarda a sala atual de cada cliente conectado como um atributo em memória (protegido pelo mesmo threading.Lock usado para o dicionário de clientes). As mensagens de broadcast (MSG) e o comando de listagem (LISTAR) passam a valer apenas para os clientes que estiverem na mesma sala de quem enviou/pediu; mensagens privadas (PRIVADA) continuam entregues diretamente a um usuário específico, independentemente da sala em que cada um esteja. O histórico de mensagens gerais usa um esquema de “última vez visto”: o servidor registra, para cada usuário, o momento em que ele saiu de cada sala (troca de sala ou desconexão); ao voltar a uma sala em que já esteve, ele recebe só as mensagens gerais enviadas enquanto estava fora dela. Um usuário que nunca esteve numa sala não recebe histórico nenhum dela — evita que um usuário novo seja inundado com conversa antiga que não diz respeito a ele. Mensagens privadas têm histórico à parte, independente de sala, reenviado uma única vez logo após o login.</w:t>
       </w:r>
     </w:p>
     <w:p>
-      <w:r>
+      <w:pPr>
+        <w:spacing w:line="360" w:lineRule="auto" w:after="120"/>
+        <w:jc w:val="both"/>
+      </w:pPr>
+      <w:r>
+        <w:rPr>
+          <w:rFonts w:ascii="Times New Roman" w:hAnsi="Times New Roman" w:eastAsia="Times New Roman"/>
+          <w:sz w:val="24"/>
+        </w:rPr>
         <w:t>Novos tipos de mensagem do protocolo: ENTRAR_SALA e LISTAR_SALAS (cliente → servidor); SALA_OK, SALA_ERRO e LISTA_SALAS (servidor → cliente). Os tipos ENTROU, SAIU, LISTA e MSG ganharam um campo adicional "sala" indicando a qual sala a notificação/lista/mensagem se refere; o mesmo campo, quando presente em HISTORICO, distingue um histórico geral (de uma sala especifica) de um histórico privado (sem esse campo).</w:t>
       </w:r>
     </w:p>
     <w:p>
-      <w:r>
-        <w:rPr>
-          <w:rFonts w:ascii="Consolas" w:hAnsi="Consolas"/>
-          <w:sz w:val="18"/>
+      <w:pPr>
+        <w:spacing w:line="240" w:lineRule="auto" w:after="120"/>
+        <w:ind w:left="1134"/>
+        <w:jc w:val="left"/>
+      </w:pPr>
+      <w:r>
+        <w:rPr>
+          <w:rFonts w:ascii="Courier New" w:hAnsi="Courier New" w:eastAsia="Courier New"/>
+          <w:sz w:val="20"/>
         </w:rPr>
         <w:t>Cliente A -&gt; Servidor:   {"tipo": "ENTRAR_SALA", "sala": "jogos"}</w:t>
         <w:br/>
@@ -1434,22 +2176,29 @@
     <w:p>
       <w:pPr>
         <w:pStyle w:val="Heading1"/>
-        <w:spacing w:after="160" w:before="320"/>
-      </w:pPr>
-      <w:r>
-        <w:rPr>
+        <w:spacing w:after="120" w:before="240" w:line="360" w:lineRule="auto"/>
+      </w:pPr>
+      <w:r>
+        <w:rPr>
+          <w:rFonts w:ascii="Times New Roman" w:hAnsi="Times New Roman" w:eastAsia="Times New Roman"/>
           <w:b/>
           <w:bCs/>
           <w:color w:val="1A4971"/>
+          <w:sz w:val="24"/>
         </w:rPr>
         <w:t xml:space="preserve">4. Justificativa da Escolha entre TCP e UDP</w:t>
       </w:r>
     </w:p>
     <w:p>
       <w:pPr>
-        <w:spacing w:after="160" w:line="300"/>
-      </w:pPr>
-      <w:r>
+        <w:spacing w:after="120" w:line="360" w:lineRule="auto"/>
+        <w:jc w:val="both"/>
+      </w:pPr>
+      <w:r>
+        <w:rPr>
+          <w:rFonts w:ascii="Times New Roman" w:hAnsi="Times New Roman" w:eastAsia="Times New Roman"/>
+          <w:sz w:val="24"/>
+        </w:rPr>
         <w:t xml:space="preserve">Optou-se pelo protocolo de transporte TCP em vez de UDP. A tabela a seguir resume os principais critérios técnicos considerados.</w:t>
       </w:r>
     </w:p>
@@ -1483,8 +2232,12 @@
             </w:tcMar>
           </w:tcPr>
           <w:p>
-            <w:r>
-              <w:rPr>
+            <w:pPr>
+              <w:spacing w:line="240" w:lineRule="auto" w:after="40"/>
+            </w:pPr>
+            <w:r>
+              <w:rPr>
+                <w:rFonts w:ascii="Times New Roman" w:hAnsi="Times New Roman" w:eastAsia="Times New Roman"/>
                 <w:b/>
                 <w:bCs/>
                 <w:color w:val="FFFFFF"/>
@@ -1507,8 +2260,12 @@
             </w:tcMar>
           </w:tcPr>
           <w:p>
-            <w:r>
-              <w:rPr>
+            <w:pPr>
+              <w:spacing w:line="240" w:lineRule="auto" w:after="40"/>
+            </w:pPr>
+            <w:r>
+              <w:rPr>
+                <w:rFonts w:ascii="Times New Roman" w:hAnsi="Times New Roman" w:eastAsia="Times New Roman"/>
                 <w:b/>
                 <w:bCs/>
                 <w:color w:val="FFFFFF"/>
@@ -1531,8 +2288,12 @@
             </w:tcMar>
           </w:tcPr>
           <w:p>
-            <w:r>
-              <w:rPr>
+            <w:pPr>
+              <w:spacing w:line="240" w:lineRule="auto" w:after="40"/>
+            </w:pPr>
+            <w:r>
+              <w:rPr>
+                <w:rFonts w:ascii="Times New Roman" w:hAnsi="Times New Roman" w:eastAsia="Times New Roman"/>
                 <w:b/>
                 <w:bCs/>
                 <w:color w:val="FFFFFF"/>
@@ -1556,9 +2317,13 @@
             </w:tcMar>
           </w:tcPr>
           <w:p>
-            <w:r>
-              <w:rPr>
-                <w:b w:val="false"/>
+            <w:pPr>
+              <w:spacing w:line="240" w:lineRule="auto" w:after="40"/>
+            </w:pPr>
+            <w:r>
+              <w:rPr>
+                <w:rFonts w:ascii="Times New Roman" w:hAnsi="Times New Roman" w:eastAsia="Times New Roman"/>
+                <w:b w:val="0"/>
                 <w:bCs w:val="false"/>
                 <w:color w:val="000000"/>
                 <w:sz w:val="20"/>
@@ -1579,9 +2344,13 @@
             </w:tcMar>
           </w:tcPr>
           <w:p>
-            <w:r>
-              <w:rPr>
-                <w:b w:val="false"/>
+            <w:pPr>
+              <w:spacing w:line="240" w:lineRule="auto" w:after="40"/>
+            </w:pPr>
+            <w:r>
+              <w:rPr>
+                <w:rFonts w:ascii="Times New Roman" w:hAnsi="Times New Roman" w:eastAsia="Times New Roman"/>
+                <w:b w:val="0"/>
                 <w:bCs w:val="false"/>
                 <w:color w:val="000000"/>
                 <w:sz w:val="20"/>
@@ -1602,9 +2371,13 @@
             </w:tcMar>
           </w:tcPr>
           <w:p>
-            <w:r>
-              <w:rPr>
-                <w:b w:val="false"/>
+            <w:pPr>
+              <w:spacing w:line="240" w:lineRule="auto" w:after="40"/>
+            </w:pPr>
+            <w:r>
+              <w:rPr>
+                <w:rFonts w:ascii="Times New Roman" w:hAnsi="Times New Roman" w:eastAsia="Times New Roman"/>
+                <w:b w:val="0"/>
                 <w:bCs w:val="false"/>
                 <w:color w:val="000000"/>
                 <w:sz w:val="20"/>
@@ -1627,9 +2400,13 @@
             </w:tcMar>
           </w:tcPr>
           <w:p>
-            <w:r>
-              <w:rPr>
-                <w:b w:val="false"/>
+            <w:pPr>
+              <w:spacing w:line="240" w:lineRule="auto" w:after="40"/>
+            </w:pPr>
+            <w:r>
+              <w:rPr>
+                <w:rFonts w:ascii="Times New Roman" w:hAnsi="Times New Roman" w:eastAsia="Times New Roman"/>
+                <w:b w:val="0"/>
                 <w:bCs w:val="false"/>
                 <w:color w:val="000000"/>
                 <w:sz w:val="20"/>
@@ -1650,9 +2427,13 @@
             </w:tcMar>
           </w:tcPr>
           <w:p>
-            <w:r>
-              <w:rPr>
-                <w:b w:val="false"/>
+            <w:pPr>
+              <w:spacing w:line="240" w:lineRule="auto" w:after="40"/>
+            </w:pPr>
+            <w:r>
+              <w:rPr>
+                <w:rFonts w:ascii="Times New Roman" w:hAnsi="Times New Roman" w:eastAsia="Times New Roman"/>
+                <w:b w:val="0"/>
                 <w:bCs w:val="false"/>
                 <w:color w:val="000000"/>
                 <w:sz w:val="20"/>
@@ -1673,9 +2454,13 @@
             </w:tcMar>
           </w:tcPr>
           <w:p>
-            <w:r>
-              <w:rPr>
-                <w:b w:val="false"/>
+            <w:pPr>
+              <w:spacing w:line="240" w:lineRule="auto" w:after="40"/>
+            </w:pPr>
+            <w:r>
+              <w:rPr>
+                <w:rFonts w:ascii="Times New Roman" w:hAnsi="Times New Roman" w:eastAsia="Times New Roman"/>
+                <w:b w:val="0"/>
                 <w:bCs w:val="false"/>
                 <w:color w:val="000000"/>
                 <w:sz w:val="20"/>
@@ -1698,9 +2483,13 @@
             </w:tcMar>
           </w:tcPr>
           <w:p>
-            <w:r>
-              <w:rPr>
-                <w:b w:val="false"/>
+            <w:pPr>
+              <w:spacing w:line="240" w:lineRule="auto" w:after="40"/>
+            </w:pPr>
+            <w:r>
+              <w:rPr>
+                <w:rFonts w:ascii="Times New Roman" w:hAnsi="Times New Roman" w:eastAsia="Times New Roman"/>
+                <w:b w:val="0"/>
                 <w:bCs w:val="false"/>
                 <w:color w:val="000000"/>
                 <w:sz w:val="20"/>
@@ -1721,9 +2510,13 @@
             </w:tcMar>
           </w:tcPr>
           <w:p>
-            <w:r>
-              <w:rPr>
-                <w:b w:val="false"/>
+            <w:pPr>
+              <w:spacing w:line="240" w:lineRule="auto" w:after="40"/>
+            </w:pPr>
+            <w:r>
+              <w:rPr>
+                <w:rFonts w:ascii="Times New Roman" w:hAnsi="Times New Roman" w:eastAsia="Times New Roman"/>
+                <w:b w:val="0"/>
                 <w:bCs w:val="false"/>
                 <w:color w:val="000000"/>
                 <w:sz w:val="20"/>
@@ -1744,9 +2537,13 @@
             </w:tcMar>
           </w:tcPr>
           <w:p>
-            <w:r>
-              <w:rPr>
-                <w:b w:val="false"/>
+            <w:pPr>
+              <w:spacing w:line="240" w:lineRule="auto" w:after="40"/>
+            </w:pPr>
+            <w:r>
+              <w:rPr>
+                <w:rFonts w:ascii="Times New Roman" w:hAnsi="Times New Roman" w:eastAsia="Times New Roman"/>
+                <w:b w:val="0"/>
                 <w:bCs w:val="false"/>
                 <w:color w:val="000000"/>
                 <w:sz w:val="20"/>
@@ -1769,9 +2566,13 @@
             </w:tcMar>
           </w:tcPr>
           <w:p>
-            <w:r>
-              <w:rPr>
-                <w:b w:val="false"/>
+            <w:pPr>
+              <w:spacing w:line="240" w:lineRule="auto" w:after="40"/>
+            </w:pPr>
+            <w:r>
+              <w:rPr>
+                <w:rFonts w:ascii="Times New Roman" w:hAnsi="Times New Roman" w:eastAsia="Times New Roman"/>
+                <w:b w:val="0"/>
                 <w:bCs w:val="false"/>
                 <w:color w:val="000000"/>
                 <w:sz w:val="20"/>
@@ -1792,9 +2593,13 @@
             </w:tcMar>
           </w:tcPr>
           <w:p>
-            <w:r>
-              <w:rPr>
-                <w:b w:val="false"/>
+            <w:pPr>
+              <w:spacing w:line="240" w:lineRule="auto" w:after="40"/>
+            </w:pPr>
+            <w:r>
+              <w:rPr>
+                <w:rFonts w:ascii="Times New Roman" w:hAnsi="Times New Roman" w:eastAsia="Times New Roman"/>
+                <w:b w:val="0"/>
                 <w:bCs w:val="false"/>
                 <w:color w:val="000000"/>
                 <w:sz w:val="20"/>
@@ -1815,9 +2620,13 @@
             </w:tcMar>
           </w:tcPr>
           <w:p>
-            <w:r>
-              <w:rPr>
-                <w:b w:val="false"/>
+            <w:pPr>
+              <w:spacing w:line="240" w:lineRule="auto" w:after="40"/>
+            </w:pPr>
+            <w:r>
+              <w:rPr>
+                <w:rFonts w:ascii="Times New Roman" w:hAnsi="Times New Roman" w:eastAsia="Times New Roman"/>
+                <w:b w:val="0"/>
                 <w:bCs w:val="false"/>
                 <w:color w:val="000000"/>
                 <w:sz w:val="20"/>
@@ -1840,9 +2649,13 @@
             </w:tcMar>
           </w:tcPr>
           <w:p>
-            <w:r>
-              <w:rPr>
-                <w:b w:val="false"/>
+            <w:pPr>
+              <w:spacing w:line="240" w:lineRule="auto" w:after="40"/>
+            </w:pPr>
+            <w:r>
+              <w:rPr>
+                <w:rFonts w:ascii="Times New Roman" w:hAnsi="Times New Roman" w:eastAsia="Times New Roman"/>
+                <w:b w:val="0"/>
                 <w:bCs w:val="false"/>
                 <w:color w:val="000000"/>
                 <w:sz w:val="20"/>
@@ -1863,9 +2676,13 @@
             </w:tcMar>
           </w:tcPr>
           <w:p>
-            <w:r>
-              <w:rPr>
-                <w:b w:val="false"/>
+            <w:pPr>
+              <w:spacing w:line="240" w:lineRule="auto" w:after="40"/>
+            </w:pPr>
+            <w:r>
+              <w:rPr>
+                <w:rFonts w:ascii="Times New Roman" w:hAnsi="Times New Roman" w:eastAsia="Times New Roman"/>
+                <w:b w:val="0"/>
                 <w:bCs w:val="false"/>
                 <w:color w:val="000000"/>
                 <w:sz w:val="20"/>
@@ -1886,9 +2703,13 @@
             </w:tcMar>
           </w:tcPr>
           <w:p>
-            <w:r>
-              <w:rPr>
-                <w:b w:val="false"/>
+            <w:pPr>
+              <w:spacing w:line="240" w:lineRule="auto" w:after="40"/>
+            </w:pPr>
+            <w:r>
+              <w:rPr>
+                <w:rFonts w:ascii="Times New Roman" w:hAnsi="Times New Roman" w:eastAsia="Times New Roman"/>
+                <w:b w:val="0"/>
                 <w:bCs w:val="false"/>
                 <w:color w:val="000000"/>
                 <w:sz w:val="20"/>
@@ -1907,31 +2728,43 @@
     </w:p>
     <w:p>
       <w:pPr>
-        <w:spacing w:after="160" w:line="300"/>
-      </w:pPr>
-      <w:r>
+        <w:spacing w:after="120" w:line="360" w:lineRule="auto"/>
+        <w:jc w:val="both"/>
+      </w:pPr>
+      <w:r>
+        <w:rPr>
+          <w:rFonts w:ascii="Times New Roman" w:hAnsi="Times New Roman" w:eastAsia="Times New Roman"/>
+          <w:sz w:val="24"/>
+        </w:rPr>
         <w:t xml:space="preserve">Em resumo: um chat de texto prioriza integridade e ordem das mensagens sobre latência mínima — diferente de aplicações como streaming de voz/vídeo ou jogos em tempo real, onde UDP costuma ser preferido justamente por dispensar a garantia de entrega em troca de menor atraso. Para o escopo deste trabalho, o TCP evita ter que reimplementar manualmente controle de confirmação, reordenação e retransmissão de pacotes na camada de aplicação, o que aumentaria significativamente a complexidade do protocolo próprio.</w:t>
       </w:r>
     </w:p>
     <w:p>
       <w:pPr>
         <w:pStyle w:val="Heading1"/>
-        <w:spacing w:after="160" w:before="320"/>
-      </w:pPr>
-      <w:r>
-        <w:rPr>
+        <w:spacing w:after="120" w:before="240" w:line="360" w:lineRule="auto"/>
+      </w:pPr>
+      <w:r>
+        <w:rPr>
+          <w:rFonts w:ascii="Times New Roman" w:hAnsi="Times New Roman" w:eastAsia="Times New Roman"/>
           <w:b/>
           <w:bCs/>
           <w:color w:val="1A4971"/>
+          <w:sz w:val="24"/>
         </w:rPr>
         <w:t xml:space="preserve">5. Testes Realizados</w:t>
       </w:r>
     </w:p>
     <w:p>
       <w:pPr>
-        <w:spacing w:after="160" w:line="300"/>
-      </w:pPr>
-      <w:r>
+        <w:spacing w:after="120" w:line="360" w:lineRule="auto"/>
+        <w:jc w:val="both"/>
+      </w:pPr>
+      <w:r>
+        <w:rPr>
+          <w:rFonts w:ascii="Times New Roman" w:hAnsi="Times New Roman" w:eastAsia="Times New Roman"/>
+          <w:sz w:val="24"/>
+        </w:rPr>
         <w:t xml:space="preserve">Os testes foram conduzidos em duas etapas: (1) testes automatizados locais, simulando múltiplos clientes via socket para validar cada funcionalidade do protocolo de forma isolada e repetível; e (2) testes manuais em rede real, com o servidor e os clientes rodando em máquinas físicas distintas do laboratório, conforme exigido pelo enunciado.</w:t>
       </w:r>
     </w:p>
@@ -1965,8 +2798,12 @@
             </w:tcMar>
           </w:tcPr>
           <w:p>
-            <w:r>
-              <w:rPr>
+            <w:pPr>
+              <w:spacing w:line="240" w:lineRule="auto" w:after="40"/>
+            </w:pPr>
+            <w:r>
+              <w:rPr>
+                <w:rFonts w:ascii="Times New Roman" w:hAnsi="Times New Roman" w:eastAsia="Times New Roman"/>
                 <w:b/>
                 <w:bCs/>
                 <w:color w:val="FFFFFF"/>
@@ -1989,8 +2826,12 @@
             </w:tcMar>
           </w:tcPr>
           <w:p>
-            <w:r>
-              <w:rPr>
+            <w:pPr>
+              <w:spacing w:line="240" w:lineRule="auto" w:after="40"/>
+            </w:pPr>
+            <w:r>
+              <w:rPr>
+                <w:rFonts w:ascii="Times New Roman" w:hAnsi="Times New Roman" w:eastAsia="Times New Roman"/>
                 <w:b/>
                 <w:bCs/>
                 <w:color w:val="FFFFFF"/>
@@ -2013,8 +2854,12 @@
             </w:tcMar>
           </w:tcPr>
           <w:p>
-            <w:r>
-              <w:rPr>
+            <w:pPr>
+              <w:spacing w:line="240" w:lineRule="auto" w:after="40"/>
+            </w:pPr>
+            <w:r>
+              <w:rPr>
+                <w:rFonts w:ascii="Times New Roman" w:hAnsi="Times New Roman" w:eastAsia="Times New Roman"/>
                 <w:b/>
                 <w:bCs/>
                 <w:color w:val="FFFFFF"/>
@@ -2038,9 +2883,13 @@
             </w:tcMar>
           </w:tcPr>
           <w:p>
-            <w:r>
-              <w:rPr>
-                <w:b w:val="false"/>
+            <w:pPr>
+              <w:spacing w:line="240" w:lineRule="auto" w:after="40"/>
+            </w:pPr>
+            <w:r>
+              <w:rPr>
+                <w:rFonts w:ascii="Times New Roman" w:hAnsi="Times New Roman" w:eastAsia="Times New Roman"/>
+                <w:b w:val="0"/>
                 <w:bCs w:val="false"/>
                 <w:color w:val="000000"/>
                 <w:sz w:val="20"/>
@@ -2061,9 +2910,13 @@
             </w:tcMar>
           </w:tcPr>
           <w:p>
-            <w:r>
-              <w:rPr>
-                <w:b w:val="false"/>
+            <w:pPr>
+              <w:spacing w:line="240" w:lineRule="auto" w:after="40"/>
+            </w:pPr>
+            <w:r>
+              <w:rPr>
+                <w:rFonts w:ascii="Times New Roman" w:hAnsi="Times New Roman" w:eastAsia="Times New Roman"/>
+                <w:b w:val="0"/>
                 <w:bCs w:val="false"/>
                 <w:color w:val="000000"/>
                 <w:sz w:val="20"/>
@@ -2084,9 +2937,13 @@
             </w:tcMar>
           </w:tcPr>
           <w:p>
-            <w:r>
-              <w:rPr>
-                <w:b w:val="false"/>
+            <w:pPr>
+              <w:spacing w:line="240" w:lineRule="auto" w:after="40"/>
+            </w:pPr>
+            <w:r>
+              <w:rPr>
+                <w:rFonts w:ascii="Times New Roman" w:hAnsi="Times New Roman" w:eastAsia="Times New Roman"/>
+                <w:b w:val="0"/>
                 <w:bCs w:val="false"/>
                 <w:color w:val="000000"/>
                 <w:sz w:val="20"/>
@@ -2109,9 +2966,13 @@
             </w:tcMar>
           </w:tcPr>
           <w:p>
-            <w:r>
-              <w:rPr>
-                <w:b w:val="false"/>
+            <w:pPr>
+              <w:spacing w:line="240" w:lineRule="auto" w:after="40"/>
+            </w:pPr>
+            <w:r>
+              <w:rPr>
+                <w:rFonts w:ascii="Times New Roman" w:hAnsi="Times New Roman" w:eastAsia="Times New Roman"/>
+                <w:b w:val="0"/>
                 <w:bCs w:val="false"/>
                 <w:color w:val="000000"/>
                 <w:sz w:val="20"/>
@@ -2132,9 +2993,13 @@
             </w:tcMar>
           </w:tcPr>
           <w:p>
-            <w:r>
-              <w:rPr>
-                <w:b w:val="false"/>
+            <w:pPr>
+              <w:spacing w:line="240" w:lineRule="auto" w:after="40"/>
+            </w:pPr>
+            <w:r>
+              <w:rPr>
+                <w:rFonts w:ascii="Times New Roman" w:hAnsi="Times New Roman" w:eastAsia="Times New Roman"/>
+                <w:b w:val="0"/>
                 <w:bCs w:val="false"/>
                 <w:color w:val="000000"/>
                 <w:sz w:val="20"/>
@@ -2155,9 +3020,13 @@
             </w:tcMar>
           </w:tcPr>
           <w:p>
-            <w:r>
-              <w:rPr>
-                <w:b w:val="false"/>
+            <w:pPr>
+              <w:spacing w:line="240" w:lineRule="auto" w:after="40"/>
+            </w:pPr>
+            <w:r>
+              <w:rPr>
+                <w:rFonts w:ascii="Times New Roman" w:hAnsi="Times New Roman" w:eastAsia="Times New Roman"/>
+                <w:b w:val="0"/>
                 <w:bCs w:val="false"/>
                 <w:color w:val="000000"/>
                 <w:sz w:val="20"/>
@@ -2180,9 +3049,13 @@
             </w:tcMar>
           </w:tcPr>
           <w:p>
-            <w:r>
-              <w:rPr>
-                <w:b w:val="false"/>
+            <w:pPr>
+              <w:spacing w:line="240" w:lineRule="auto" w:after="40"/>
+            </w:pPr>
+            <w:r>
+              <w:rPr>
+                <w:rFonts w:ascii="Times New Roman" w:hAnsi="Times New Roman" w:eastAsia="Times New Roman"/>
+                <w:b w:val="0"/>
                 <w:bCs w:val="false"/>
                 <w:color w:val="000000"/>
                 <w:sz w:val="20"/>
@@ -2203,9 +3076,13 @@
             </w:tcMar>
           </w:tcPr>
           <w:p>
-            <w:r>
-              <w:rPr>
-                <w:b w:val="false"/>
+            <w:pPr>
+              <w:spacing w:line="240" w:lineRule="auto" w:after="40"/>
+            </w:pPr>
+            <w:r>
+              <w:rPr>
+                <w:rFonts w:ascii="Times New Roman" w:hAnsi="Times New Roman" w:eastAsia="Times New Roman"/>
+                <w:b w:val="0"/>
                 <w:bCs w:val="false"/>
                 <w:color w:val="000000"/>
                 <w:sz w:val="20"/>
@@ -2226,9 +3103,13 @@
             </w:tcMar>
           </w:tcPr>
           <w:p>
-            <w:r>
-              <w:rPr>
-                <w:b w:val="false"/>
+            <w:pPr>
+              <w:spacing w:line="240" w:lineRule="auto" w:after="40"/>
+            </w:pPr>
+            <w:r>
+              <w:rPr>
+                <w:rFonts w:ascii="Times New Roman" w:hAnsi="Times New Roman" w:eastAsia="Times New Roman"/>
+                <w:b w:val="0"/>
                 <w:bCs w:val="false"/>
                 <w:color w:val="000000"/>
                 <w:sz w:val="20"/>
@@ -2251,9 +3132,13 @@
             </w:tcMar>
           </w:tcPr>
           <w:p>
-            <w:r>
-              <w:rPr>
-                <w:b w:val="false"/>
+            <w:pPr>
+              <w:spacing w:line="240" w:lineRule="auto" w:after="40"/>
+            </w:pPr>
+            <w:r>
+              <w:rPr>
+                <w:rFonts w:ascii="Times New Roman" w:hAnsi="Times New Roman" w:eastAsia="Times New Roman"/>
+                <w:b w:val="0"/>
                 <w:bCs w:val="false"/>
                 <w:color w:val="000000"/>
                 <w:sz w:val="20"/>
@@ -2274,9 +3159,13 @@
             </w:tcMar>
           </w:tcPr>
           <w:p>
-            <w:r>
-              <w:rPr>
-                <w:b w:val="false"/>
+            <w:pPr>
+              <w:spacing w:line="240" w:lineRule="auto" w:after="40"/>
+            </w:pPr>
+            <w:r>
+              <w:rPr>
+                <w:rFonts w:ascii="Times New Roman" w:hAnsi="Times New Roman" w:eastAsia="Times New Roman"/>
+                <w:b w:val="0"/>
                 <w:bCs w:val="false"/>
                 <w:color w:val="000000"/>
                 <w:sz w:val="20"/>
@@ -2297,9 +3186,13 @@
             </w:tcMar>
           </w:tcPr>
           <w:p>
-            <w:r>
-              <w:rPr>
-                <w:b w:val="false"/>
+            <w:pPr>
+              <w:spacing w:line="240" w:lineRule="auto" w:after="40"/>
+            </w:pPr>
+            <w:r>
+              <w:rPr>
+                <w:rFonts w:ascii="Times New Roman" w:hAnsi="Times New Roman" w:eastAsia="Times New Roman"/>
+                <w:b w:val="0"/>
                 <w:bCs w:val="false"/>
                 <w:color w:val="000000"/>
                 <w:sz w:val="20"/>
@@ -2322,9 +3215,13 @@
             </w:tcMar>
           </w:tcPr>
           <w:p>
-            <w:r>
-              <w:rPr>
-                <w:b w:val="false"/>
+            <w:pPr>
+              <w:spacing w:line="240" w:lineRule="auto" w:after="40"/>
+            </w:pPr>
+            <w:r>
+              <w:rPr>
+                <w:rFonts w:ascii="Times New Roman" w:hAnsi="Times New Roman" w:eastAsia="Times New Roman"/>
+                <w:b w:val="0"/>
                 <w:bCs w:val="false"/>
                 <w:color w:val="000000"/>
                 <w:sz w:val="20"/>
@@ -2345,9 +3242,13 @@
             </w:tcMar>
           </w:tcPr>
           <w:p>
-            <w:r>
-              <w:rPr>
-                <w:b w:val="false"/>
+            <w:pPr>
+              <w:spacing w:line="240" w:lineRule="auto" w:after="40"/>
+            </w:pPr>
+            <w:r>
+              <w:rPr>
+                <w:rFonts w:ascii="Times New Roman" w:hAnsi="Times New Roman" w:eastAsia="Times New Roman"/>
+                <w:b w:val="0"/>
                 <w:bCs w:val="false"/>
                 <w:color w:val="000000"/>
                 <w:sz w:val="20"/>
@@ -2368,9 +3269,13 @@
             </w:tcMar>
           </w:tcPr>
           <w:p>
-            <w:r>
-              <w:rPr>
-                <w:b w:val="false"/>
+            <w:pPr>
+              <w:spacing w:line="240" w:lineRule="auto" w:after="40"/>
+            </w:pPr>
+            <w:r>
+              <w:rPr>
+                <w:rFonts w:ascii="Times New Roman" w:hAnsi="Times New Roman" w:eastAsia="Times New Roman"/>
+                <w:b w:val="0"/>
                 <w:bCs w:val="false"/>
                 <w:color w:val="000000"/>
                 <w:sz w:val="20"/>
@@ -2393,9 +3298,13 @@
             </w:tcMar>
           </w:tcPr>
           <w:p>
-            <w:r>
-              <w:rPr>
-                <w:b w:val="false"/>
+            <w:pPr>
+              <w:spacing w:line="240" w:lineRule="auto" w:after="40"/>
+            </w:pPr>
+            <w:r>
+              <w:rPr>
+                <w:rFonts w:ascii="Times New Roman" w:hAnsi="Times New Roman" w:eastAsia="Times New Roman"/>
+                <w:b w:val="0"/>
                 <w:bCs w:val="false"/>
                 <w:color w:val="000000"/>
                 <w:sz w:val="20"/>
@@ -2416,9 +3325,13 @@
             </w:tcMar>
           </w:tcPr>
           <w:p>
-            <w:r>
-              <w:rPr>
-                <w:b w:val="false"/>
+            <w:pPr>
+              <w:spacing w:line="240" w:lineRule="auto" w:after="40"/>
+            </w:pPr>
+            <w:r>
+              <w:rPr>
+                <w:rFonts w:ascii="Times New Roman" w:hAnsi="Times New Roman" w:eastAsia="Times New Roman"/>
+                <w:b w:val="0"/>
                 <w:bCs w:val="false"/>
                 <w:color w:val="000000"/>
                 <w:sz w:val="20"/>
@@ -2439,9 +3352,13 @@
             </w:tcMar>
           </w:tcPr>
           <w:p>
-            <w:r>
-              <w:rPr>
-                <w:b w:val="false"/>
+            <w:pPr>
+              <w:spacing w:line="240" w:lineRule="auto" w:after="40"/>
+            </w:pPr>
+            <w:r>
+              <w:rPr>
+                <w:rFonts w:ascii="Times New Roman" w:hAnsi="Times New Roman" w:eastAsia="Times New Roman"/>
+                <w:b w:val="0"/>
                 <w:bCs w:val="false"/>
                 <w:color w:val="000000"/>
                 <w:sz w:val="20"/>
@@ -2464,9 +3381,13 @@
             </w:tcMar>
           </w:tcPr>
           <w:p>
-            <w:r>
-              <w:rPr>
-                <w:b w:val="false"/>
+            <w:pPr>
+              <w:spacing w:line="240" w:lineRule="auto" w:after="40"/>
+            </w:pPr>
+            <w:r>
+              <w:rPr>
+                <w:rFonts w:ascii="Times New Roman" w:hAnsi="Times New Roman" w:eastAsia="Times New Roman"/>
+                <w:b w:val="0"/>
                 <w:bCs w:val="false"/>
                 <w:color w:val="000000"/>
                 <w:sz w:val="20"/>
@@ -2487,9 +3408,13 @@
             </w:tcMar>
           </w:tcPr>
           <w:p>
-            <w:r>
-              <w:rPr>
-                <w:b w:val="false"/>
+            <w:pPr>
+              <w:spacing w:line="240" w:lineRule="auto" w:after="40"/>
+            </w:pPr>
+            <w:r>
+              <w:rPr>
+                <w:rFonts w:ascii="Times New Roman" w:hAnsi="Times New Roman" w:eastAsia="Times New Roman"/>
+                <w:b w:val="0"/>
                 <w:bCs w:val="false"/>
                 <w:color w:val="000000"/>
                 <w:sz w:val="20"/>
@@ -2510,9 +3435,13 @@
             </w:tcMar>
           </w:tcPr>
           <w:p>
-            <w:r>
-              <w:rPr>
-                <w:b w:val="false"/>
+            <w:pPr>
+              <w:spacing w:line="240" w:lineRule="auto" w:after="40"/>
+            </w:pPr>
+            <w:r>
+              <w:rPr>
+                <w:rFonts w:ascii="Times New Roman" w:hAnsi="Times New Roman" w:eastAsia="Times New Roman"/>
+                <w:b w:val="0"/>
                 <w:bCs w:val="false"/>
                 <w:color w:val="000000"/>
                 <w:sz w:val="20"/>
@@ -2535,9 +3464,13 @@
             </w:tcMar>
           </w:tcPr>
           <w:p>
-            <w:r>
-              <w:rPr>
-                <w:b w:val="false"/>
+            <w:pPr>
+              <w:spacing w:line="240" w:lineRule="auto" w:after="40"/>
+            </w:pPr>
+            <w:r>
+              <w:rPr>
+                <w:rFonts w:ascii="Times New Roman" w:hAnsi="Times New Roman" w:eastAsia="Times New Roman"/>
+                <w:b w:val="0"/>
                 <w:bCs w:val="false"/>
                 <w:color w:val="000000"/>
                 <w:sz w:val="20"/>
@@ -2558,9 +3491,13 @@
             </w:tcMar>
           </w:tcPr>
           <w:p>
-            <w:r>
-              <w:rPr>
-                <w:b w:val="false"/>
+            <w:pPr>
+              <w:spacing w:line="240" w:lineRule="auto" w:after="40"/>
+            </w:pPr>
+            <w:r>
+              <w:rPr>
+                <w:rFonts w:ascii="Times New Roman" w:hAnsi="Times New Roman" w:eastAsia="Times New Roman"/>
+                <w:b w:val="0"/>
                 <w:bCs w:val="false"/>
                 <w:color w:val="000000"/>
                 <w:sz w:val="20"/>
@@ -2581,9 +3518,13 @@
             </w:tcMar>
           </w:tcPr>
           <w:p>
-            <w:r>
-              <w:rPr>
-                <w:b w:val="false"/>
+            <w:pPr>
+              <w:spacing w:line="240" w:lineRule="auto" w:after="40"/>
+            </w:pPr>
+            <w:r>
+              <w:rPr>
+                <w:rFonts w:ascii="Times New Roman" w:hAnsi="Times New Roman" w:eastAsia="Times New Roman"/>
+                <w:b w:val="0"/>
                 <w:bCs w:val="false"/>
                 <w:color w:val="000000"/>
                 <w:sz w:val="20"/>
@@ -2606,9 +3547,13 @@
             </w:tcMar>
           </w:tcPr>
           <w:p>
-            <w:r>
-              <w:rPr>
-                <w:b w:val="false"/>
+            <w:pPr>
+              <w:spacing w:line="240" w:lineRule="auto" w:after="40"/>
+            </w:pPr>
+            <w:r>
+              <w:rPr>
+                <w:rFonts w:ascii="Times New Roman" w:hAnsi="Times New Roman" w:eastAsia="Times New Roman"/>
+                <w:b w:val="0"/>
                 <w:bCs w:val="false"/>
                 <w:color w:val="000000"/>
                 <w:sz w:val="20"/>
@@ -2629,9 +3574,13 @@
             </w:tcMar>
           </w:tcPr>
           <w:p>
-            <w:r>
-              <w:rPr>
-                <w:b w:val="false"/>
+            <w:pPr>
+              <w:spacing w:line="240" w:lineRule="auto" w:after="40"/>
+            </w:pPr>
+            <w:r>
+              <w:rPr>
+                <w:rFonts w:ascii="Times New Roman" w:hAnsi="Times New Roman" w:eastAsia="Times New Roman"/>
+                <w:b w:val="0"/>
                 <w:bCs w:val="false"/>
                 <w:color w:val="000000"/>
                 <w:sz w:val="20"/>
@@ -2652,9 +3601,13 @@
             </w:tcMar>
           </w:tcPr>
           <w:p>
-            <w:r>
-              <w:rPr>
-                <w:b w:val="false"/>
+            <w:pPr>
+              <w:spacing w:line="240" w:lineRule="auto" w:after="40"/>
+            </w:pPr>
+            <w:r>
+              <w:rPr>
+                <w:rFonts w:ascii="Times New Roman" w:hAnsi="Times New Roman" w:eastAsia="Times New Roman"/>
+                <w:b w:val="0"/>
                 <w:bCs w:val="false"/>
                 <w:color w:val="000000"/>
                 <w:sz w:val="20"/>
@@ -2677,9 +3630,13 @@
             </w:tcMar>
           </w:tcPr>
           <w:p>
-            <w:r>
-              <w:rPr>
-                <w:b w:val="false"/>
+            <w:pPr>
+              <w:spacing w:line="240" w:lineRule="auto" w:after="40"/>
+            </w:pPr>
+            <w:r>
+              <w:rPr>
+                <w:rFonts w:ascii="Times New Roman" w:hAnsi="Times New Roman" w:eastAsia="Times New Roman"/>
+                <w:b w:val="0"/>
                 <w:bCs w:val="false"/>
                 <w:color w:val="000000"/>
                 <w:sz w:val="20"/>
@@ -2700,9 +3657,13 @@
             </w:tcMar>
           </w:tcPr>
           <w:p>
-            <w:r>
-              <w:rPr>
-                <w:b w:val="false"/>
+            <w:pPr>
+              <w:spacing w:line="240" w:lineRule="auto" w:after="40"/>
+            </w:pPr>
+            <w:r>
+              <w:rPr>
+                <w:rFonts w:ascii="Times New Roman" w:hAnsi="Times New Roman" w:eastAsia="Times New Roman"/>
+                <w:b w:val="0"/>
                 <w:bCs w:val="false"/>
                 <w:color w:val="000000"/>
                 <w:sz w:val="20"/>
@@ -2723,9 +3684,13 @@
             </w:tcMar>
           </w:tcPr>
           <w:p>
-            <w:r>
-              <w:rPr>
-                <w:b w:val="false"/>
+            <w:pPr>
+              <w:spacing w:line="240" w:lineRule="auto" w:after="40"/>
+            </w:pPr>
+            <w:r>
+              <w:rPr>
+                <w:rFonts w:ascii="Times New Roman" w:hAnsi="Times New Roman" w:eastAsia="Times New Roman"/>
+                <w:b w:val="0"/>
                 <w:bCs w:val="false"/>
                 <w:color w:val="000000"/>
                 <w:sz w:val="20"/>
@@ -2748,9 +3713,13 @@
             </w:tcMar>
           </w:tcPr>
           <w:p>
-            <w:r>
-              <w:rPr>
-                <w:b w:val="false"/>
+            <w:pPr>
+              <w:spacing w:line="240" w:lineRule="auto" w:after="40"/>
+            </w:pPr>
+            <w:r>
+              <w:rPr>
+                <w:rFonts w:ascii="Times New Roman" w:hAnsi="Times New Roman" w:eastAsia="Times New Roman"/>
+                <w:b w:val="0"/>
                 <w:bCs w:val="false"/>
                 <w:color w:val="000000"/>
                 <w:sz w:val="20"/>
@@ -2771,9 +3740,13 @@
             </w:tcMar>
           </w:tcPr>
           <w:p>
-            <w:r>
-              <w:rPr>
-                <w:b w:val="false"/>
+            <w:pPr>
+              <w:spacing w:line="240" w:lineRule="auto" w:after="40"/>
+            </w:pPr>
+            <w:r>
+              <w:rPr>
+                <w:rFonts w:ascii="Times New Roman" w:hAnsi="Times New Roman" w:eastAsia="Times New Roman"/>
+                <w:b w:val="0"/>
                 <w:bCs w:val="false"/>
                 <w:color w:val="000000"/>
                 <w:sz w:val="20"/>
@@ -2794,9 +3767,13 @@
             </w:tcMar>
           </w:tcPr>
           <w:p>
-            <w:r>
-              <w:rPr>
-                <w:b w:val="false"/>
+            <w:pPr>
+              <w:spacing w:line="240" w:lineRule="auto" w:after="40"/>
+            </w:pPr>
+            <w:r>
+              <w:rPr>
+                <w:rFonts w:ascii="Times New Roman" w:hAnsi="Times New Roman" w:eastAsia="Times New Roman"/>
+                <w:b w:val="0"/>
                 <w:bCs w:val="false"/>
                 <w:color w:val="000000"/>
                 <w:sz w:val="20"/>
@@ -2810,32 +3787,16 @@
     </w:tbl>
     <w:p>
       <w:pPr>
-        <w:spacing w:before="200"/>
-      </w:pPr>
-    </w:p>
-    <w:p>
-      <w:pPr>
-        <w:spacing w:after="160" w:line="300"/>
-      </w:pPr>
-      <w:r>
-        <w:rPr>
-          <w:i/>
-          <w:iCs/>
-          <w:color w:val="B7791F"/>
-        </w:rPr>
-        <w:t xml:space="preserve">[ESPAÇO PARA A DUPLA PREENCHER] Descrever aqui os detalhes específicos do teste em laboratório: IPs utilizados, sistema operacional de cada máquina, eventual necessidade de liberar a porta no firewall, e qualquer comportamento observado ao conectar/desconectar clientes durante a execução real.</w:t>
-      </w:r>
-    </w:p>
-    <w:p>
-      <w:pPr>
         <w:pStyle w:val="Heading1"/>
-        <w:spacing w:after="160" w:before="320"/>
-      </w:pPr>
-      <w:r>
-        <w:rPr>
+        <w:spacing w:after="120" w:before="240" w:line="360" w:lineRule="auto"/>
+      </w:pPr>
+      <w:r>
+        <w:rPr>
+          <w:rFonts w:ascii="Times New Roman" w:hAnsi="Times New Roman" w:eastAsia="Times New Roman"/>
           <w:b/>
           <w:bCs/>
           <w:color w:val="1A4971"/>
+          <w:sz w:val="24"/>
         </w:rPr>
         <w:t xml:space="preserve">6. Dificuldades Encontradas e Soluções Adotadas</w:t>
       </w:r>
@@ -2843,116 +3804,151 @@
     <w:p>
       <w:pPr>
         <w:pStyle w:val="Heading2"/>
-        <w:spacing w:after="120" w:before="240"/>
-      </w:pPr>
-      <w:r>
-        <w:rPr>
+        <w:spacing w:after="120" w:before="240" w:line="360" w:lineRule="auto"/>
+      </w:pPr>
+      <w:r>
+        <w:rPr>
+          <w:rFonts w:ascii="Times New Roman" w:hAnsi="Times New Roman" w:eastAsia="Times New Roman"/>
           <w:b/>
           <w:bCs/>
           <w:color w:val="2B6CB0"/>
+          <w:sz w:val="24"/>
         </w:rPr>
         <w:t xml:space="preserve">6.1 Fronteiras de mensagem no fluxo TCP</w:t>
       </w:r>
     </w:p>
     <w:p>
       <w:pPr>
-        <w:spacing w:after="160" w:line="300"/>
-      </w:pPr>
-      <w:r>
+        <w:spacing w:after="120" w:line="360" w:lineRule="auto"/>
+        <w:jc w:val="both"/>
+      </w:pPr>
+      <w:r>
+        <w:rPr>
+          <w:rFonts w:ascii="Times New Roman" w:hAnsi="Times New Roman" w:eastAsia="Times New Roman"/>
+          <w:sz w:val="24"/>
+        </w:rPr>
         <w:t xml:space="preserve">Como o TCP não preserva limites entre chamadas de send(), duas mensagens JSON enviadas em sequência podem chegar coladas em uma única leitura, ou uma mensagem pode chegar fragmentada em múltiplas leituras. Solução: uso de um delimitador ('\n') e de um buffer acumulador (classe LeitorDeMensagens), que só entrega uma mensagem ao restante do código quando o delimitador é encontrado no buffer.</w:t>
       </w:r>
     </w:p>
     <w:p>
       <w:pPr>
         <w:pStyle w:val="Heading2"/>
-        <w:spacing w:after="120" w:before="240"/>
-      </w:pPr>
-      <w:r>
-        <w:rPr>
+        <w:spacing w:after="120" w:before="240" w:line="360" w:lineRule="auto"/>
+      </w:pPr>
+      <w:r>
+        <w:rPr>
+          <w:rFonts w:ascii="Times New Roman" w:hAnsi="Times New Roman" w:eastAsia="Times New Roman"/>
           <w:b/>
           <w:bCs/>
           <w:color w:val="2B6CB0"/>
+          <w:sz w:val="24"/>
         </w:rPr>
         <w:t xml:space="preserve">6.2 Concorrência no acesso à lista de clientes</w:t>
       </w:r>
     </w:p>
     <w:p>
       <w:pPr>
-        <w:spacing w:after="160" w:line="300"/>
-      </w:pPr>
-      <w:r>
+        <w:spacing w:after="120" w:line="360" w:lineRule="auto"/>
+        <w:jc w:val="both"/>
+      </w:pPr>
+      <w:r>
+        <w:rPr>
+          <w:rFonts w:ascii="Times New Roman" w:hAnsi="Times New Roman" w:eastAsia="Times New Roman"/>
+          <w:sz w:val="24"/>
+        </w:rPr>
         <w:t xml:space="preserve">Com uma thread por cliente, múltiplas threads podem tentar ler/alterar o dicionário de usuários conectados ao mesmo tempo (ex.: dois logins simultâneos com o mesmo apelido). Solução: uso de threading.Lock envolvendo todas as seções que leem ou modificam esse estado compartilhado.</w:t>
       </w:r>
     </w:p>
     <w:p>
       <w:pPr>
         <w:pStyle w:val="Heading2"/>
-        <w:spacing w:after="120" w:before="240"/>
-      </w:pPr>
-      <w:r>
-        <w:rPr>
+        <w:spacing w:after="120" w:before="240" w:line="360" w:lineRule="auto"/>
+      </w:pPr>
+      <w:r>
+        <w:rPr>
+          <w:rFonts w:ascii="Times New Roman" w:hAnsi="Times New Roman" w:eastAsia="Times New Roman"/>
           <w:b/>
           <w:bCs/>
           <w:color w:val="2B6CB0"/>
+          <w:sz w:val="24"/>
         </w:rPr>
         <w:t xml:space="preserve">6.3 Desconexões abruptas</w:t>
       </w:r>
     </w:p>
     <w:p>
       <w:pPr>
-        <w:spacing w:after="160" w:line="300"/>
-      </w:pPr>
-      <w:r>
+        <w:spacing w:after="120" w:line="360" w:lineRule="auto"/>
+        <w:jc w:val="both"/>
+      </w:pPr>
+      <w:r>
+        <w:rPr>
+          <w:rFonts w:ascii="Times New Roman" w:hAnsi="Times New Roman" w:eastAsia="Times New Roman"/>
+          <w:sz w:val="24"/>
+        </w:rPr>
         <w:t xml:space="preserve">Quando um cliente fecha o terminal ou perde a conexão de rede abruptamente, o servidor precisa detectar isso sem travar. Solução: tratamento das exceções ConnectionResetError/OSError na leitura do socket, tratando um recv() vazio como sinal de desconexão e removendo o cliente da lista compartilhada de forma segura.</w:t>
       </w:r>
     </w:p>
     <w:p>
       <w:pPr>
         <w:pStyle w:val="Heading2"/>
-        <w:spacing w:after="120" w:before="240"/>
-      </w:pPr>
-      <w:r>
-        <w:rPr>
+        <w:spacing w:after="120" w:before="240" w:line="360" w:lineRule="auto"/>
+      </w:pPr>
+      <w:r>
+        <w:rPr>
+          <w:rFonts w:ascii="Times New Roman" w:hAnsi="Times New Roman" w:eastAsia="Times New Roman"/>
           <w:b/>
           <w:bCs/>
           <w:color w:val="2B6CB0"/>
+          <w:sz w:val="24"/>
         </w:rPr>
         <w:t xml:space="preserve">6.4 Endereço do servidor não pode ser fixo</w:t>
       </w:r>
     </w:p>
     <w:p>
       <w:pPr>
-        <w:spacing w:after="160" w:line="300"/>
-      </w:pPr>
-      <w:r>
+        <w:spacing w:after="120" w:line="360" w:lineRule="auto"/>
+        <w:jc w:val="both"/>
+      </w:pPr>
+      <w:r>
+        <w:rPr>
+          <w:rFonts w:ascii="Times New Roman" w:hAnsi="Times New Roman" w:eastAsia="Times New Roman"/>
+          <w:sz w:val="24"/>
+        </w:rPr>
         <w:t xml:space="preserve">Para que o mesmo código funcione tanto em testes locais quanto no laboratório (máquinas diferentes), o IP e a porta do servidor nunca foram fixados no código: são recebidos via argumentos de linha de comando (--host, --porta) ou digitados interativamente pelo usuário.</w:t>
       </w:r>
     </w:p>
     <w:p>
       <w:pPr>
         <w:pStyle w:val="Heading1"/>
-        <w:spacing w:after="160" w:before="320"/>
-      </w:pPr>
-      <w:r>
-        <w:rPr>
+        <w:spacing w:after="120" w:before="240" w:line="360" w:lineRule="auto"/>
+      </w:pPr>
+      <w:r>
+        <w:rPr>
+          <w:rFonts w:ascii="Times New Roman" w:hAnsi="Times New Roman" w:eastAsia="Times New Roman"/>
           <w:b/>
           <w:bCs/>
           <w:color w:val="1A4971"/>
+          <w:sz w:val="24"/>
         </w:rPr>
         <w:t xml:space="preserve">7. Conclusão</w:t>
       </w:r>
     </w:p>
     <w:p>
       <w:pPr>
-        <w:spacing w:after="160" w:line="300"/>
-      </w:pPr>
-      <w:r>
+        <w:spacing w:after="120" w:line="360" w:lineRule="auto"/>
+        <w:jc w:val="both"/>
+      </w:pPr>
+      <w:r>
+        <w:rPr>
+          <w:rFonts w:ascii="Times New Roman" w:hAnsi="Times New Roman" w:eastAsia="Times New Roman"/>
+          <w:sz w:val="24"/>
+        </w:rPr>
         <w:t>O trabalho permitiu aplicar na prática os conceitos de programação com sockets, protocolos de aplicação e transporte confiável estudados na disciplina. A implementação atende a todos os requisitos funcionais obrigatórios do enunciado — múltiplos clientes simultâneos, identificação por apelido único, broadcast, mensagens privadas, notificações de entrada/saída, listagem de usuários e encerramento controlado — além de um protocolo de aplicação próprio, documentado e configurável quanto ao endereço de rede utilizado, e de três itens opcionais: interface gráfica, persistência de histórico e salas/canais temáticos.</w:t>
       </w:r>
     </w:p>
     <w:sectPr>
       <w:pgSz w:w="11906" w:h="16838" w:orient="portrait"/>
-      <w:pgMar w:top="1134" w:right="1134" w:bottom="1134" w:left="1134" w:header="708" w:footer="708" w:gutter="0"/>
+      <w:pgMar w:top="1701" w:right="1134" w:bottom="1134" w:left="1701" w:header="708" w:footer="708" w:gutter="0"/>
       <w:pgNumType/>
       <w:docGrid w:linePitch="360"/>
     </w:sectPr>

</xml_diff>